<commit_message>
Update BC CĐ ASPNET VuVanHoa_170124242_DK24TTC2.docx
</commit_message>
<xml_diff>
--- a/progress-report/BC CĐ ASPNET VuVanHoa_170124242_DK24TTC2.docx
+++ b/progress-report/BC CĐ ASPNET VuVanHoa_170124242_DK24TTC2.docx
@@ -1,6 +1,6 @@
 
 <file path=word/document.xml><?xml version="1.0" encoding="utf-8"?>
-<w:document xmlns:wpc="http://schemas.microsoft.com/office/word/2010/wordprocessingCanvas" xmlns:cx="http://schemas.microsoft.com/office/drawing/2014/chartex" xmlns:mc="http://schemas.openxmlformats.org/markup-compatibility/2006" xmlns:o="urn:schemas-microsoft-com:office:office" xmlns:r="http://schemas.openxmlformats.org/officeDocument/2006/relationships" xmlns:m="http://schemas.openxmlformats.org/officeDocument/2006/math" xmlns:v="urn:schemas-microsoft-com:vml" xmlns:wp14="http://schemas.microsoft.com/office/word/2010/wordprocessingDrawing" xmlns:wp="http://schemas.openxmlformats.org/drawingml/2006/wordprocessingDrawing" xmlns:w10="urn:schemas-microsoft-com:office:word" xmlns:w="http://schemas.openxmlformats.org/wordprocessingml/2006/main" xmlns:w14="http://schemas.microsoft.com/office/word/2010/wordml" xmlns:w15="http://schemas.microsoft.com/office/word/2012/wordml" xmlns:w16se="http://schemas.microsoft.com/office/word/2015/wordml/symex" xmlns:wpg="http://schemas.microsoft.com/office/word/2010/wordprocessingGroup" xmlns:wpi="http://schemas.microsoft.com/office/word/2010/wordprocessingInk" xmlns:wne="http://schemas.microsoft.com/office/word/2006/wordml" xmlns:wps="http://schemas.microsoft.com/office/word/2010/wordprocessingShape" mc:Ignorable="w14 w15 w16se wp14">
+<w:document xmlns:wpc="http://schemas.microsoft.com/office/word/2010/wordprocessingCanvas" xmlns:cx="http://schemas.microsoft.com/office/drawing/2014/chartex" xmlns:cx1="http://schemas.microsoft.com/office/drawing/2015/9/8/chartex" xmlns:cx2="http://schemas.microsoft.com/office/drawing/2015/10/21/chartex" xmlns:cx3="http://schemas.microsoft.com/office/drawing/2016/5/9/chartex" xmlns:cx4="http://schemas.microsoft.com/office/drawing/2016/5/10/chartex" xmlns:cx5="http://schemas.microsoft.com/office/drawing/2016/5/11/chartex" xmlns:cx6="http://schemas.microsoft.com/office/drawing/2016/5/12/chartex" xmlns:cx7="http://schemas.microsoft.com/office/drawing/2016/5/13/chartex" xmlns:cx8="http://schemas.microsoft.com/office/drawing/2016/5/14/chartex" xmlns:mc="http://schemas.openxmlformats.org/markup-compatibility/2006" xmlns:aink="http://schemas.microsoft.com/office/drawing/2016/ink" xmlns:am3d="http://schemas.microsoft.com/office/drawing/2017/model3d" xmlns:o="urn:schemas-microsoft-com:office:office" xmlns:oel="http://schemas.microsoft.com/office/2019/extlst" xmlns:r="http://schemas.openxmlformats.org/officeDocument/2006/relationships" xmlns:m="http://schemas.openxmlformats.org/officeDocument/2006/math" xmlns:v="urn:schemas-microsoft-com:vml" xmlns:wp14="http://schemas.microsoft.com/office/word/2010/wordprocessingDrawing" xmlns:wp="http://schemas.openxmlformats.org/drawingml/2006/wordprocessingDrawing" xmlns:w10="urn:schemas-microsoft-com:office:word" xmlns:w="http://schemas.openxmlformats.org/wordprocessingml/2006/main" xmlns:w14="http://schemas.microsoft.com/office/word/2010/wordml" xmlns:w15="http://schemas.microsoft.com/office/word/2012/wordml" xmlns:w16cex="http://schemas.microsoft.com/office/word/2018/wordml/cex" xmlns:w16cid="http://schemas.microsoft.com/office/word/2016/wordml/cid" xmlns:w16="http://schemas.microsoft.com/office/word/2018/wordml" xmlns:w16du="http://schemas.microsoft.com/office/word/2023/wordml/word16du" xmlns:w16sdtdh="http://schemas.microsoft.com/office/word/2020/wordml/sdtdatahash" xmlns:w16sdtfl="http://schemas.microsoft.com/office/word/2024/wordml/sdtformatlock" xmlns:w16se="http://schemas.microsoft.com/office/word/2015/wordml/symex" xmlns:wpg="http://schemas.microsoft.com/office/word/2010/wordprocessingGroup" xmlns:wpi="http://schemas.microsoft.com/office/word/2010/wordprocessingInk" xmlns:wne="http://schemas.microsoft.com/office/word/2006/wordml" xmlns:wps="http://schemas.microsoft.com/office/word/2010/wordprocessingShape" mc:Ignorable="w14 w15 w16se w16cid w16 w16cex w16sdtdh w16sdtfl w16du wp14">
   <w:body>
     <w:p>
       <w:pPr>
@@ -183,7 +183,7 @@
           <w:szCs w:val="26"/>
         </w:rPr>
         <w:drawing>
-          <wp:inline distT="0" distB="0" distL="0" distR="0" wp14:anchorId="009F6C81" wp14:editId="10B693E8">
+          <wp:inline distT="0" distB="0" distL="0" distR="0" wp14:anchorId="009F6C81" wp14:editId="1826DBEC">
             <wp:extent cx="914400" cy="899160"/>
             <wp:effectExtent l="0" t="0" r="0" b="0"/>
             <wp:docPr id="13" name="Picture 13" descr="images"/>
@@ -1044,7 +1044,7 @@
           <w:szCs w:val="26"/>
         </w:rPr>
         <w:drawing>
-          <wp:inline distT="0" distB="0" distL="0" distR="0" wp14:anchorId="122B581B" wp14:editId="74F5B1E5">
+          <wp:inline distT="0" distB="0" distL="0" distR="0" wp14:anchorId="122B581B" wp14:editId="09BC4EC7">
             <wp:extent cx="914400" cy="899160"/>
             <wp:effectExtent l="0" t="0" r="0" b="0"/>
             <wp:docPr id="4" name="Picture 4" descr="images"/>
@@ -3567,18 +3567,6 @@
                           </w:p>
                           <w:p>
                             <w:pPr>
-                              <w:tabs>
-                                <w:tab w:val="left" w:pos="540"/>
-                                <w:tab w:val="right" w:leader="dot" w:pos="7740"/>
-                              </w:tabs>
-                              <w:jc w:val="both"/>
-                            </w:pPr>
-                            <w:r>
-                              <w:tab/>
-                            </w:r>
-                          </w:p>
-                          <w:p>
-                            <w:pPr>
                               <w:ind w:left="2160" w:firstLine="720"/>
                               <w:jc w:val="center"/>
                               <w:rPr>
@@ -3720,7 +3708,7 @@
           </mc:Choice>
           <mc:Fallback>
             <w:pict>
-              <v:rect w14:anchorId="29A1B693" id="Rectangle 1" o:spid="_x0000_s1031" style="position:absolute;margin-left:23.25pt;margin-top:-17.2pt;width:423pt;height:674.75pt;z-index:251646976;visibility:visible;mso-wrap-style:square;mso-width-percent:0;mso-height-percent:0;mso-wrap-distance-left:9pt;mso-wrap-distance-top:0;mso-wrap-distance-right:9pt;mso-wrap-distance-bottom:0;mso-position-horizontal:absolute;mso-position-horizontal-relative:margin;mso-position-vertical:absolute;mso-position-vertical-relative:text;mso-width-percent:0;mso-height-percent:0;mso-width-relative:page;mso-height-relative:page;v-text-anchor:top" o:gfxdata="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">
+              <v:rect w14:anchorId="29A1B693" id="Rectangle 1" o:spid="_x0000_s1031" style="position:absolute;margin-left:23.25pt;margin-top:-17.2pt;width:423pt;height:674.75pt;z-index:251646976;visibility:visible;mso-wrap-style:square;mso-width-percent:0;mso-height-percent:0;mso-wrap-distance-left:9pt;mso-wrap-distance-top:0;mso-wrap-distance-right:9pt;mso-wrap-distance-bottom:0;mso-position-horizontal:absolute;mso-position-horizontal-relative:margin;mso-position-vertical:absolute;mso-position-vertical-relative:text;mso-width-percent:0;mso-height-percent:0;mso-width-relative:page;mso-height-relative:page;v-text-anchor:top" o:gfxdata="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">
                 <v:textbox>
                   <w:txbxContent>
                     <w:p>
@@ -4188,18 +4176,6 @@
                       <w:r>
                         <w:tab/>
                       </w:r>
-                      <w:r>
-                        <w:tab/>
-                      </w:r>
-                    </w:p>
-                    <w:p>
-                      <w:pPr>
-                        <w:tabs>
-                          <w:tab w:val="left" w:pos="540"/>
-                          <w:tab w:val="right" w:leader="dot" w:pos="7740"/>
-                        </w:tabs>
-                        <w:jc w:val="both"/>
-                      </w:pPr>
                       <w:r>
                         <w:tab/>
                       </w:r>
@@ -17340,7 +17316,8 @@
           <w:b/>
           <w:bCs/>
           <w:color w:val="000000"/>
-          <w:szCs w:val="26"/>
+          <w:sz w:val="28"/>
+          <w:szCs w:val="28"/>
         </w:rPr>
       </w:pPr>
       <w:r>
@@ -17349,7 +17326,8 @@
           <w:b/>
           <w:bCs/>
           <w:color w:val="000000"/>
-          <w:szCs w:val="26"/>
+          <w:sz w:val="28"/>
+          <w:szCs w:val="28"/>
         </w:rPr>
         <w:lastRenderedPageBreak/>
         <w:t xml:space="preserve">MỞ </w:t>
@@ -17361,7 +17339,8 @@
           <w:bCs/>
           <w:color w:val="000000"/>
           <w:w w:val="99"/>
-          <w:szCs w:val="26"/>
+          <w:sz w:val="28"/>
+          <w:szCs w:val="28"/>
         </w:rPr>
         <w:t>ĐẦU</w:t>
       </w:r>
@@ -20292,10 +20271,19 @@
           <w:i/>
         </w:rPr>
       </w:pPr>
-      <w:r>
+    </w:p>
+    <w:p>
+      <w:pPr>
+        <w:pStyle w:val="BaoCao"/>
         <w:rPr>
           <w:i/>
         </w:rPr>
+      </w:pPr>
+      <w:r>
+        <w:rPr>
+          <w:i/>
+        </w:rPr>
+        <w:lastRenderedPageBreak/>
         <w:t>Một số Web Server Controls thông dụng gồm:</w:t>
       </w:r>
     </w:p>
@@ -20308,8 +20296,8 @@
       </w:tblPr>
       <w:tblGrid>
         <w:gridCol w:w="2546"/>
-        <w:gridCol w:w="3558"/>
-        <w:gridCol w:w="3007"/>
+        <w:gridCol w:w="3544"/>
+        <w:gridCol w:w="3021"/>
       </w:tblGrid>
       <w:tr>
         <w:trPr>
@@ -20337,14 +20325,13 @@
                 <w:color w:val="000000"/>
                 <w:szCs w:val="26"/>
               </w:rPr>
-              <w:lastRenderedPageBreak/>
               <w:t>Nhóm</w:t>
             </w:r>
           </w:p>
         </w:tc>
         <w:tc>
           <w:tcPr>
-            <w:tcW w:w="3558" w:type="dxa"/>
+            <w:tcW w:w="3544" w:type="dxa"/>
           </w:tcPr>
           <w:p>
             <w:pPr>
@@ -20370,7 +20357,7 @@
         </w:tc>
         <w:tc>
           <w:tcPr>
-            <w:tcW w:w="3007" w:type="dxa"/>
+            <w:tcW w:w="3021" w:type="dxa"/>
           </w:tcPr>
           <w:p>
             <w:pPr>
@@ -20424,7 +20411,7 @@
         </w:tc>
         <w:tc>
           <w:tcPr>
-            <w:tcW w:w="3558" w:type="dxa"/>
+            <w:tcW w:w="3544" w:type="dxa"/>
           </w:tcPr>
           <w:p>
             <w:pPr>
@@ -20447,7 +20434,7 @@
         </w:tc>
         <w:tc>
           <w:tcPr>
-            <w:tcW w:w="3007" w:type="dxa"/>
+            <w:tcW w:w="3021" w:type="dxa"/>
           </w:tcPr>
           <w:p>
             <w:pPr>
@@ -20498,7 +20485,7 @@
         </w:tc>
         <w:tc>
           <w:tcPr>
-            <w:tcW w:w="3558" w:type="dxa"/>
+            <w:tcW w:w="3544" w:type="dxa"/>
           </w:tcPr>
           <w:p>
             <w:pPr>
@@ -20521,7 +20508,7 @@
         </w:tc>
         <w:tc>
           <w:tcPr>
-            <w:tcW w:w="3007" w:type="dxa"/>
+            <w:tcW w:w="3021" w:type="dxa"/>
           </w:tcPr>
           <w:p>
             <w:pPr>
@@ -20572,7 +20559,7 @@
         </w:tc>
         <w:tc>
           <w:tcPr>
-            <w:tcW w:w="3558" w:type="dxa"/>
+            <w:tcW w:w="3544" w:type="dxa"/>
             <w:vAlign w:val="center"/>
           </w:tcPr>
           <w:p>
@@ -20596,7 +20583,7 @@
         </w:tc>
         <w:tc>
           <w:tcPr>
-            <w:tcW w:w="3007" w:type="dxa"/>
+            <w:tcW w:w="3021" w:type="dxa"/>
           </w:tcPr>
           <w:p>
             <w:pPr>
@@ -20647,7 +20634,7 @@
         </w:tc>
         <w:tc>
           <w:tcPr>
-            <w:tcW w:w="3558" w:type="dxa"/>
+            <w:tcW w:w="3544" w:type="dxa"/>
           </w:tcPr>
           <w:p>
             <w:pPr>
@@ -20670,7 +20657,7 @@
         </w:tc>
         <w:tc>
           <w:tcPr>
-            <w:tcW w:w="3007" w:type="dxa"/>
+            <w:tcW w:w="3021" w:type="dxa"/>
           </w:tcPr>
           <w:p>
             <w:pPr>
@@ -20721,7 +20708,7 @@
         </w:tc>
         <w:tc>
           <w:tcPr>
-            <w:tcW w:w="3558" w:type="dxa"/>
+            <w:tcW w:w="3544" w:type="dxa"/>
             <w:vAlign w:val="center"/>
           </w:tcPr>
           <w:p>
@@ -20745,7 +20732,7 @@
         </w:tc>
         <w:tc>
           <w:tcPr>
-            <w:tcW w:w="3007" w:type="dxa"/>
+            <w:tcW w:w="3021" w:type="dxa"/>
           </w:tcPr>
           <w:p>
             <w:pPr>
@@ -20796,7 +20783,7 @@
         </w:tc>
         <w:tc>
           <w:tcPr>
-            <w:tcW w:w="3558" w:type="dxa"/>
+            <w:tcW w:w="3544" w:type="dxa"/>
             <w:vAlign w:val="center"/>
           </w:tcPr>
           <w:p>
@@ -20820,7 +20807,7 @@
         </w:tc>
         <w:tc>
           <w:tcPr>
-            <w:tcW w:w="3007" w:type="dxa"/>
+            <w:tcW w:w="3021" w:type="dxa"/>
           </w:tcPr>
           <w:p>
             <w:pPr>
@@ -21229,17 +21216,6 @@
     </w:tbl>
     <w:p>
       <w:pPr>
-        <w:pStyle w:val="Heading2"/>
-        <w:rPr>
-          <w:rFonts w:cs="Times New Roman"/>
-          <w:bCs/>
-          <w:color w:val="000000"/>
-          <w:spacing w:val="-2"/>
-        </w:rPr>
-      </w:pPr>
-    </w:p>
-    <w:p>
-      <w:pPr>
         <w:spacing w:before="120" w:after="120" w:line="360" w:lineRule="auto"/>
         <w:rPr>
           <w:rFonts w:eastAsiaTheme="majorEastAsia" w:cs="Times New Roman"/>
@@ -21497,20 +21473,22 @@
         <w:tblLook w:val="04A0" w:firstRow="1" w:lastRow="0" w:firstColumn="1" w:lastColumn="0" w:noHBand="0" w:noVBand="1"/>
       </w:tblPr>
       <w:tblGrid>
-        <w:gridCol w:w="2958"/>
-        <w:gridCol w:w="3009"/>
-        <w:gridCol w:w="3144"/>
+        <w:gridCol w:w="2546"/>
+        <w:gridCol w:w="2694"/>
+        <w:gridCol w:w="3871"/>
       </w:tblGrid>
       <w:tr>
+        <w:trPr>
+          <w:cantSplit/>
+        </w:trPr>
         <w:tc>
           <w:tcPr>
-            <w:tcW w:w="0" w:type="auto"/>
+            <w:tcW w:w="2546" w:type="dxa"/>
             <w:vAlign w:val="center"/>
           </w:tcPr>
           <w:p>
             <w:pPr>
               <w:spacing w:before="120" w:after="120" w:line="23" w:lineRule="atLeast"/>
-              <w:jc w:val="center"/>
               <w:rPr>
                 <w:rFonts w:cs="Times New Roman"/>
                 <w:b/>
@@ -21531,13 +21509,12 @@
         </w:tc>
         <w:tc>
           <w:tcPr>
-            <w:tcW w:w="0" w:type="auto"/>
+            <w:tcW w:w="2694" w:type="dxa"/>
             <w:vAlign w:val="center"/>
           </w:tcPr>
           <w:p>
             <w:pPr>
               <w:spacing w:before="120" w:after="120" w:line="23" w:lineRule="atLeast"/>
-              <w:jc w:val="center"/>
               <w:rPr>
                 <w:rFonts w:cs="Times New Roman"/>
                 <w:b/>
@@ -21557,13 +21534,12 @@
         </w:tc>
         <w:tc>
           <w:tcPr>
-            <w:tcW w:w="0" w:type="auto"/>
+            <w:tcW w:w="3871" w:type="dxa"/>
             <w:vAlign w:val="center"/>
           </w:tcPr>
           <w:p>
             <w:pPr>
               <w:spacing w:before="120" w:after="120" w:line="23" w:lineRule="atLeast"/>
-              <w:jc w:val="center"/>
               <w:rPr>
                 <w:rFonts w:cs="Times New Roman"/>
                 <w:b/>
@@ -21584,11 +21560,12 @@
       </w:tr>
       <w:tr>
         <w:trPr>
-          <w:trHeight w:val="1118"/>
+          <w:cantSplit/>
+          <w:trHeight w:val="862"/>
         </w:trPr>
         <w:tc>
           <w:tcPr>
-            <w:tcW w:w="0" w:type="auto"/>
+            <w:tcW w:w="2546" w:type="dxa"/>
             <w:vAlign w:val="center"/>
           </w:tcPr>
           <w:p>
@@ -21621,7 +21598,7 @@
         </w:tc>
         <w:tc>
           <w:tcPr>
-            <w:tcW w:w="0" w:type="auto"/>
+            <w:tcW w:w="2694" w:type="dxa"/>
             <w:vAlign w:val="center"/>
           </w:tcPr>
           <w:p>
@@ -21645,7 +21622,7 @@
         </w:tc>
         <w:tc>
           <w:tcPr>
-            <w:tcW w:w="0" w:type="auto"/>
+            <w:tcW w:w="3871" w:type="dxa"/>
             <w:vAlign w:val="center"/>
           </w:tcPr>
           <w:p>
@@ -21670,11 +21647,12 @@
       </w:tr>
       <w:tr>
         <w:trPr>
-          <w:trHeight w:val="908"/>
+          <w:cantSplit/>
+          <w:trHeight w:val="978"/>
         </w:trPr>
         <w:tc>
           <w:tcPr>
-            <w:tcW w:w="0" w:type="auto"/>
+            <w:tcW w:w="2546" w:type="dxa"/>
             <w:vAlign w:val="center"/>
           </w:tcPr>
           <w:p>
@@ -21707,7 +21685,7 @@
         </w:tc>
         <w:tc>
           <w:tcPr>
-            <w:tcW w:w="0" w:type="auto"/>
+            <w:tcW w:w="2694" w:type="dxa"/>
             <w:vAlign w:val="center"/>
           </w:tcPr>
           <w:p>
@@ -21731,7 +21709,7 @@
         </w:tc>
         <w:tc>
           <w:tcPr>
-            <w:tcW w:w="0" w:type="auto"/>
+            <w:tcW w:w="3871" w:type="dxa"/>
             <w:vAlign w:val="center"/>
           </w:tcPr>
           <w:p>
@@ -21756,11 +21734,12 @@
       </w:tr>
       <w:tr>
         <w:trPr>
-          <w:trHeight w:val="1404"/>
+          <w:cantSplit/>
+          <w:trHeight w:val="1122"/>
         </w:trPr>
         <w:tc>
           <w:tcPr>
-            <w:tcW w:w="0" w:type="auto"/>
+            <w:tcW w:w="2546" w:type="dxa"/>
             <w:vAlign w:val="center"/>
           </w:tcPr>
           <w:p>
@@ -21793,7 +21772,7 @@
         </w:tc>
         <w:tc>
           <w:tcPr>
-            <w:tcW w:w="0" w:type="auto"/>
+            <w:tcW w:w="2694" w:type="dxa"/>
             <w:vAlign w:val="center"/>
           </w:tcPr>
           <w:p>
@@ -21817,7 +21796,7 @@
         </w:tc>
         <w:tc>
           <w:tcPr>
-            <w:tcW w:w="0" w:type="auto"/>
+            <w:tcW w:w="3871" w:type="dxa"/>
             <w:vAlign w:val="center"/>
           </w:tcPr>
           <w:p>
@@ -21842,11 +21821,12 @@
       </w:tr>
       <w:tr>
         <w:trPr>
+          <w:cantSplit/>
           <w:trHeight w:val="1099"/>
         </w:trPr>
         <w:tc>
           <w:tcPr>
-            <w:tcW w:w="0" w:type="auto"/>
+            <w:tcW w:w="2546" w:type="dxa"/>
             <w:vAlign w:val="center"/>
           </w:tcPr>
           <w:p>
@@ -21879,7 +21859,7 @@
         </w:tc>
         <w:tc>
           <w:tcPr>
-            <w:tcW w:w="0" w:type="auto"/>
+            <w:tcW w:w="2694" w:type="dxa"/>
             <w:vAlign w:val="center"/>
           </w:tcPr>
           <w:p>
@@ -21903,7 +21883,7 @@
         </w:tc>
         <w:tc>
           <w:tcPr>
-            <w:tcW w:w="0" w:type="auto"/>
+            <w:tcW w:w="3871" w:type="dxa"/>
             <w:vAlign w:val="center"/>
           </w:tcPr>
           <w:p>
@@ -21927,9 +21907,12 @@
         </w:tc>
       </w:tr>
       <w:tr>
+        <w:trPr>
+          <w:cantSplit/>
+        </w:trPr>
         <w:tc>
           <w:tcPr>
-            <w:tcW w:w="0" w:type="auto"/>
+            <w:tcW w:w="2546" w:type="dxa"/>
             <w:vAlign w:val="center"/>
           </w:tcPr>
           <w:p>
@@ -21955,7 +21938,7 @@
         </w:tc>
         <w:tc>
           <w:tcPr>
-            <w:tcW w:w="0" w:type="auto"/>
+            <w:tcW w:w="2694" w:type="dxa"/>
             <w:vAlign w:val="center"/>
           </w:tcPr>
           <w:p>
@@ -21979,7 +21962,7 @@
         </w:tc>
         <w:tc>
           <w:tcPr>
-            <w:tcW w:w="0" w:type="auto"/>
+            <w:tcW w:w="3871" w:type="dxa"/>
             <w:vAlign w:val="center"/>
           </w:tcPr>
           <w:p>
@@ -22003,9 +21986,12 @@
         </w:tc>
       </w:tr>
       <w:tr>
+        <w:trPr>
+          <w:cantSplit/>
+        </w:trPr>
         <w:tc>
           <w:tcPr>
-            <w:tcW w:w="0" w:type="auto"/>
+            <w:tcW w:w="2546" w:type="dxa"/>
             <w:vAlign w:val="center"/>
           </w:tcPr>
           <w:p>
@@ -22031,7 +22017,7 @@
         </w:tc>
         <w:tc>
           <w:tcPr>
-            <w:tcW w:w="0" w:type="auto"/>
+            <w:tcW w:w="2694" w:type="dxa"/>
             <w:vAlign w:val="center"/>
           </w:tcPr>
           <w:p>
@@ -22055,7 +22041,7 @@
         </w:tc>
         <w:tc>
           <w:tcPr>
-            <w:tcW w:w="0" w:type="auto"/>
+            <w:tcW w:w="3871" w:type="dxa"/>
             <w:vAlign w:val="center"/>
           </w:tcPr>
           <w:p>
@@ -22079,9 +22065,12 @@
         </w:tc>
       </w:tr>
       <w:tr>
+        <w:trPr>
+          <w:cantSplit/>
+        </w:trPr>
         <w:tc>
           <w:tcPr>
-            <w:tcW w:w="0" w:type="auto"/>
+            <w:tcW w:w="2546" w:type="dxa"/>
             <w:vAlign w:val="center"/>
           </w:tcPr>
           <w:p>
@@ -22106,7 +22095,7 @@
         </w:tc>
         <w:tc>
           <w:tcPr>
-            <w:tcW w:w="0" w:type="auto"/>
+            <w:tcW w:w="2694" w:type="dxa"/>
             <w:vAlign w:val="center"/>
           </w:tcPr>
           <w:p>
@@ -22129,7 +22118,7 @@
         </w:tc>
         <w:tc>
           <w:tcPr>
-            <w:tcW w:w="0" w:type="auto"/>
+            <w:tcW w:w="3871" w:type="dxa"/>
             <w:vAlign w:val="center"/>
           </w:tcPr>
           <w:p>
@@ -22153,9 +22142,12 @@
         </w:tc>
       </w:tr>
       <w:tr>
+        <w:trPr>
+          <w:cantSplit/>
+        </w:trPr>
         <w:tc>
           <w:tcPr>
-            <w:tcW w:w="0" w:type="auto"/>
+            <w:tcW w:w="2546" w:type="dxa"/>
             <w:vAlign w:val="center"/>
           </w:tcPr>
           <w:p>
@@ -22180,7 +22172,7 @@
         </w:tc>
         <w:tc>
           <w:tcPr>
-            <w:tcW w:w="0" w:type="auto"/>
+            <w:tcW w:w="2694" w:type="dxa"/>
             <w:vAlign w:val="center"/>
           </w:tcPr>
           <w:p>
@@ -22203,7 +22195,7 @@
         </w:tc>
         <w:tc>
           <w:tcPr>
-            <w:tcW w:w="0" w:type="auto"/>
+            <w:tcW w:w="3871" w:type="dxa"/>
             <w:vAlign w:val="center"/>
           </w:tcPr>
           <w:p>
@@ -22268,7 +22260,6 @@
         <w:ind w:left="0" w:firstLine="567"/>
       </w:pPr>
       <w:r>
-        <w:lastRenderedPageBreak/>
         <w:t>Mở kết nối (Open Connection) bằng đối tượng SqlConnection.</w:t>
       </w:r>
     </w:p>
@@ -22295,6 +22286,7 @@
         <w:ind w:left="0" w:firstLine="567"/>
       </w:pPr>
       <w:r>
+        <w:lastRenderedPageBreak/>
         <w:t>Đọc hoặc lấy dữ liệu bằng SqlDataReader hoặc DataAdapter + DataSet.</w:t>
       </w:r>
     </w:p>
@@ -22628,7 +22620,6 @@
       </w:pPr>
       <w:bookmarkStart w:id="158" w:name="_Toc214624476"/>
       <w:r>
-        <w:lastRenderedPageBreak/>
         <w:t>2.6.3 Cấu trúc của SQL Server</w:t>
       </w:r>
       <w:bookmarkEnd w:id="158"/>
@@ -22693,6 +22684,7 @@
         <w:rPr>
           <w:b/>
         </w:rPr>
+        <w:lastRenderedPageBreak/>
         <w:t>Database Engine</w:t>
       </w:r>
       <w:r>
@@ -22931,23 +22923,23 @@
         <w:pStyle w:val="BaoCao"/>
       </w:pPr>
       <w:r>
+        <w:t>Tăng tốc quá trình phát triển giao diện web.</w:t>
+      </w:r>
+    </w:p>
+    <w:p>
+      <w:pPr>
+        <w:pStyle w:val="BaoCao"/>
+      </w:pPr>
+      <w:r>
+        <w:t>Đảm bảo tính thống nhất về thiết kế trên nhiều trình duyệt và thiết bị.</w:t>
+      </w:r>
+    </w:p>
+    <w:p>
+      <w:pPr>
+        <w:pStyle w:val="BaoCao"/>
+      </w:pPr>
+      <w:r>
         <w:lastRenderedPageBreak/>
-        <w:t>Tăng tốc quá trình phát triển giao diện web.</w:t>
-      </w:r>
-    </w:p>
-    <w:p>
-      <w:pPr>
-        <w:pStyle w:val="BaoCao"/>
-      </w:pPr>
-      <w:r>
-        <w:t>Đảm bảo tính thống nhất về thiết kế trên nhiều trình duyệt và thiết bị.</w:t>
-      </w:r>
-    </w:p>
-    <w:p>
-      <w:pPr>
-        <w:pStyle w:val="BaoCao"/>
-      </w:pPr>
-      <w:r>
         <w:t>Hỗ trợ thiết kế web responsive (giao diện thích ứng với mọi kích thước màn hình).</w:t>
       </w:r>
     </w:p>
@@ -23126,6 +23118,16 @@
         <w:pStyle w:val="Heading3"/>
       </w:pPr>
       <w:bookmarkStart w:id="166" w:name="_Toc214624484"/>
+    </w:p>
+    <w:p>
+      <w:pPr>
+        <w:pStyle w:val="Heading3"/>
+      </w:pPr>
+    </w:p>
+    <w:p>
+      <w:pPr>
+        <w:pStyle w:val="Heading3"/>
+      </w:pPr>
       <w:r>
         <w:lastRenderedPageBreak/>
         <w:t xml:space="preserve">2.7.4 </w:t>
@@ -23636,18 +23638,96 @@
       </w:pPr>
       <w:r>
         <w:rPr>
+          <w:b/>
+          <w:bCs/>
+          <w:i/>
+          <w:iCs/>
+          <w:noProof/>
+        </w:rPr>
+        <w:drawing>
+          <wp:anchor distT="0" distB="0" distL="114300" distR="114300" simplePos="0" relativeHeight="251780096" behindDoc="1" locked="0" layoutInCell="1" allowOverlap="1" wp14:anchorId="0A51DE3A" wp14:editId="0FF70F79">
+            <wp:simplePos x="0" y="0"/>
+            <wp:positionH relativeFrom="margin">
+              <wp:posOffset>-1905</wp:posOffset>
+            </wp:positionH>
+            <wp:positionV relativeFrom="paragraph">
+              <wp:posOffset>392430</wp:posOffset>
+            </wp:positionV>
+            <wp:extent cx="5972175" cy="2035810"/>
+            <wp:effectExtent l="0" t="0" r="9525" b="2540"/>
+            <wp:wrapTopAndBottom/>
+            <wp:docPr id="8506196" name="Picture 1"/>
+            <wp:cNvGraphicFramePr>
+              <a:graphicFrameLocks xmlns:a="http://schemas.openxmlformats.org/drawingml/2006/main" noChangeAspect="1"/>
+            </wp:cNvGraphicFramePr>
+            <a:graphic xmlns:a="http://schemas.openxmlformats.org/drawingml/2006/main">
+              <a:graphicData uri="http://schemas.openxmlformats.org/drawingml/2006/picture">
+                <pic:pic xmlns:pic="http://schemas.openxmlformats.org/drawingml/2006/picture">
+                  <pic:nvPicPr>
+                    <pic:cNvPr id="8506196" name=""/>
+                    <pic:cNvPicPr/>
+                  </pic:nvPicPr>
+                  <pic:blipFill>
+                    <a:blip r:embed="rId12">
+                      <a:extLst>
+                        <a:ext uri="{28A0092B-C50C-407E-A947-70E740481C1C}">
+                          <a14:useLocalDpi xmlns:a14="http://schemas.microsoft.com/office/drawing/2010/main" val="0"/>
+                        </a:ext>
+                      </a:extLst>
+                    </a:blip>
+                    <a:stretch>
+                      <a:fillRect/>
+                    </a:stretch>
+                  </pic:blipFill>
+                  <pic:spPr>
+                    <a:xfrm>
+                      <a:off x="0" y="0"/>
+                      <a:ext cx="5972175" cy="2035810"/>
+                    </a:xfrm>
+                    <a:prstGeom prst="rect">
+                      <a:avLst/>
+                    </a:prstGeom>
+                  </pic:spPr>
+                </pic:pic>
+              </a:graphicData>
+            </a:graphic>
+            <wp14:sizeRelV relativeFrom="margin">
+              <wp14:pctHeight>0</wp14:pctHeight>
+            </wp14:sizeRelV>
+          </wp:anchor>
+        </w:drawing>
+      </w:r>
+      <w:r>
+        <w:rPr>
+          <w:b/>
+          <w:bCs/>
+          <w:i/>
+          <w:iCs/>
+        </w:rPr>
+        <w:t>Dưới đây là một số bảng dữ liệu thực nghiệm chính</w:t>
+      </w:r>
+      <w:r>
+        <w:t>:</w:t>
+      </w:r>
+    </w:p>
+    <w:p>
+      <w:pPr>
+        <w:pStyle w:val="BaoCao"/>
+      </w:pPr>
+      <w:r>
+        <w:rPr>
           <w:noProof/>
         </w:rPr>
         <mc:AlternateContent>
           <mc:Choice Requires="wps">
             <w:drawing>
-              <wp:anchor distT="0" distB="0" distL="114300" distR="114300" simplePos="0" relativeHeight="251784192" behindDoc="0" locked="0" layoutInCell="1" allowOverlap="1" wp14:anchorId="4925A4A4" wp14:editId="749F411A">
+              <wp:anchor distT="0" distB="0" distL="114300" distR="114300" simplePos="0" relativeHeight="251784192" behindDoc="0" locked="0" layoutInCell="1" allowOverlap="1" wp14:anchorId="4925A4A4" wp14:editId="4EBEA215">
                 <wp:simplePos x="0" y="0"/>
                 <wp:positionH relativeFrom="margin">
-                  <wp:posOffset>1555687</wp:posOffset>
+                  <wp:posOffset>1555115</wp:posOffset>
                 </wp:positionH>
                 <wp:positionV relativeFrom="paragraph">
-                  <wp:posOffset>2577150</wp:posOffset>
+                  <wp:posOffset>2216150</wp:posOffset>
                 </wp:positionV>
                 <wp:extent cx="2876550" cy="241300"/>
                 <wp:effectExtent l="0" t="0" r="0" b="6350"/>
@@ -23779,7 +23859,11 @@
           </mc:Choice>
           <mc:Fallback>
             <w:pict>
-              <v:shape w14:anchorId="4925A4A4" id="_x0000_s1033" type="#_x0000_t202" style="position:absolute;left:0;text-align:left;margin-left:122.5pt;margin-top:202.95pt;width:226.5pt;height:19pt;z-index:251784192;visibility:visible;mso-wrap-style:square;mso-width-percent:0;mso-height-percent:0;mso-wrap-distance-left:9pt;mso-wrap-distance-top:0;mso-wrap-distance-right:9pt;mso-wrap-distance-bottom:0;mso-position-horizontal:absolute;mso-position-horizontal-relative:margin;mso-position-vertical:absolute;mso-position-vertical-relative:text;mso-width-percent:0;mso-height-percent:0;mso-width-relative:margin;mso-height-relative:margin;v-text-anchor:top" o:gfxdata="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" stroked="f">
+              <v:shapetype w14:anchorId="4925A4A4" id="_x0000_t202" coordsize="21600,21600" o:spt="202" path="m,l,21600r21600,l21600,xe">
+                <v:stroke joinstyle="miter"/>
+                <v:path gradientshapeok="t" o:connecttype="rect"/>
+              </v:shapetype>
+              <v:shape id="_x0000_s1033" type="#_x0000_t202" style="position:absolute;left:0;text-align:left;margin-left:122.45pt;margin-top:174.5pt;width:226.5pt;height:19pt;z-index:251784192;visibility:visible;mso-wrap-style:square;mso-width-percent:0;mso-height-percent:0;mso-wrap-distance-left:9pt;mso-wrap-distance-top:0;mso-wrap-distance-right:9pt;mso-wrap-distance-bottom:0;mso-position-horizontal:absolute;mso-position-horizontal-relative:margin;mso-position-vertical:absolute;mso-position-vertical-relative:text;mso-width-percent:0;mso-height-percent:0;mso-width-relative:margin;mso-height-relative:margin;v-text-anchor:top" o:gfxdata="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" stroked="f">
                 <v:textbox inset="0,0,0,0">
                   <w:txbxContent>
                     <w:p>
@@ -23797,7 +23881,7 @@
                           <w:szCs w:val="26"/>
                         </w:rPr>
                       </w:pPr>
-                      <w:bookmarkStart w:id="175" w:name="_Toc214615944"/>
+                      <w:bookmarkStart w:id="174" w:name="_Toc214615944"/>
                       <w:r>
                         <w:rPr>
                           <w:iCs w:val="0"/>
@@ -23862,7 +23946,7 @@
                         </w:rPr>
                         <w:t xml:space="preserve"> Bảng dữ liệu tài khoản người dùng</w:t>
                       </w:r>
-                      <w:bookmarkEnd w:id="175"/>
+                      <w:bookmarkEnd w:id="174"/>
                     </w:p>
                   </w:txbxContent>
                 </v:textbox>
@@ -23873,178 +23957,31 @@
         </mc:AlternateContent>
       </w:r>
       <w:r>
-        <w:rPr>
-          <w:b/>
-          <w:bCs/>
-          <w:i/>
-          <w:iCs/>
+        <w:t xml:space="preserve">- Bảng dữ liệu người dùng cho thấy các thông tin tài khoản khách hàng, người dùng đăng ký được lưu vào CSDL của hệ thống. </w:t>
+      </w:r>
+    </w:p>
+    <w:p>
+      <w:pPr>
+        <w:pStyle w:val="BaoCao"/>
+      </w:pPr>
+      <w:r>
+        <w:rPr>
           <w:noProof/>
         </w:rPr>
-        <w:drawing>
-          <wp:anchor distT="0" distB="0" distL="114300" distR="114300" simplePos="0" relativeHeight="251780096" behindDoc="1" locked="0" layoutInCell="1" allowOverlap="1" wp14:anchorId="0A51DE3A" wp14:editId="01C70515">
-            <wp:simplePos x="0" y="0"/>
-            <wp:positionH relativeFrom="margin">
-              <wp:posOffset>-1905</wp:posOffset>
-            </wp:positionH>
-            <wp:positionV relativeFrom="paragraph">
-              <wp:posOffset>392430</wp:posOffset>
-            </wp:positionV>
-            <wp:extent cx="5972175" cy="2035810"/>
-            <wp:effectExtent l="0" t="0" r="9525" b="2540"/>
-            <wp:wrapTopAndBottom/>
-            <wp:docPr id="8506196" name="Picture 1"/>
-            <wp:cNvGraphicFramePr>
-              <a:graphicFrameLocks xmlns:a="http://schemas.openxmlformats.org/drawingml/2006/main" noChangeAspect="1"/>
-            </wp:cNvGraphicFramePr>
-            <a:graphic xmlns:a="http://schemas.openxmlformats.org/drawingml/2006/main">
-              <a:graphicData uri="http://schemas.openxmlformats.org/drawingml/2006/picture">
-                <pic:pic xmlns:pic="http://schemas.openxmlformats.org/drawingml/2006/picture">
-                  <pic:nvPicPr>
-                    <pic:cNvPr id="8506196" name=""/>
-                    <pic:cNvPicPr/>
-                  </pic:nvPicPr>
-                  <pic:blipFill>
-                    <a:blip r:embed="rId12">
-                      <a:extLst>
-                        <a:ext uri="{28A0092B-C50C-407E-A947-70E740481C1C}">
-                          <a14:useLocalDpi xmlns:a14="http://schemas.microsoft.com/office/drawing/2010/main" val="0"/>
-                        </a:ext>
-                      </a:extLst>
-                    </a:blip>
-                    <a:stretch>
-                      <a:fillRect/>
-                    </a:stretch>
-                  </pic:blipFill>
-                  <pic:spPr>
-                    <a:xfrm>
-                      <a:off x="0" y="0"/>
-                      <a:ext cx="5972175" cy="2035810"/>
-                    </a:xfrm>
-                    <a:prstGeom prst="rect">
-                      <a:avLst/>
-                    </a:prstGeom>
-                  </pic:spPr>
-                </pic:pic>
-              </a:graphicData>
-            </a:graphic>
-            <wp14:sizeRelV relativeFrom="margin">
-              <wp14:pctHeight>0</wp14:pctHeight>
-            </wp14:sizeRelV>
-          </wp:anchor>
-        </w:drawing>
-      </w:r>
-      <w:r>
-        <w:rPr>
-          <w:b/>
-          <w:bCs/>
-          <w:i/>
-          <w:iCs/>
-        </w:rPr>
-        <w:t>Dưới đây là một số bảng dữ liệu thực nghiệm chính</w:t>
-      </w:r>
-      <w:r>
-        <w:t>:</w:t>
-      </w:r>
-    </w:p>
-    <w:p>
-      <w:pPr>
-        <w:spacing w:before="120" w:after="120" w:line="360" w:lineRule="auto"/>
-        <w:rPr>
-          <w:rFonts w:cs="Times New Roman"/>
-          <w:szCs w:val="26"/>
-        </w:rPr>
-      </w:pPr>
-      <w:r>
-        <w:rPr>
-          <w:rFonts w:cs="Times New Roman"/>
-          <w:szCs w:val="26"/>
-        </w:rPr>
-        <w:br w:type="page"/>
-      </w:r>
-    </w:p>
-    <w:p>
-      <w:pPr>
-        <w:spacing w:before="120" w:after="120" w:line="360" w:lineRule="auto"/>
-        <w:rPr>
-          <w:rFonts w:cs="Times New Roman"/>
-          <w:szCs w:val="26"/>
-        </w:rPr>
-      </w:pPr>
-      <w:r>
-        <w:rPr>
-          <w:noProof/>
-        </w:rPr>
         <w:lastRenderedPageBreak/>
-        <w:drawing>
-          <wp:anchor distT="0" distB="0" distL="114300" distR="114300" simplePos="0" relativeHeight="251782144" behindDoc="0" locked="0" layoutInCell="1" allowOverlap="1" wp14:anchorId="4B1A97F9" wp14:editId="1D1A88A0">
-            <wp:simplePos x="0" y="0"/>
-            <wp:positionH relativeFrom="margin">
-              <wp:align>center</wp:align>
-            </wp:positionH>
-            <wp:positionV relativeFrom="page">
-              <wp:posOffset>3249300</wp:posOffset>
-            </wp:positionV>
-            <wp:extent cx="5972175" cy="1949450"/>
-            <wp:effectExtent l="0" t="0" r="9525" b="0"/>
-            <wp:wrapTopAndBottom/>
-            <wp:docPr id="1778109843" name="Picture 1"/>
-            <wp:cNvGraphicFramePr>
-              <a:graphicFrameLocks xmlns:a="http://schemas.openxmlformats.org/drawingml/2006/main" noChangeAspect="1"/>
-            </wp:cNvGraphicFramePr>
-            <a:graphic xmlns:a="http://schemas.openxmlformats.org/drawingml/2006/main">
-              <a:graphicData uri="http://schemas.openxmlformats.org/drawingml/2006/picture">
-                <pic:pic xmlns:pic="http://schemas.openxmlformats.org/drawingml/2006/picture">
-                  <pic:nvPicPr>
-                    <pic:cNvPr id="1778109843" name=""/>
-                    <pic:cNvPicPr/>
-                  </pic:nvPicPr>
-                  <pic:blipFill>
-                    <a:blip r:embed="rId13">
-                      <a:extLst>
-                        <a:ext uri="{28A0092B-C50C-407E-A947-70E740481C1C}">
-                          <a14:useLocalDpi xmlns:a14="http://schemas.microsoft.com/office/drawing/2010/main" val="0"/>
-                        </a:ext>
-                      </a:extLst>
-                    </a:blip>
-                    <a:stretch>
-                      <a:fillRect/>
-                    </a:stretch>
-                  </pic:blipFill>
-                  <pic:spPr>
-                    <a:xfrm>
-                      <a:off x="0" y="0"/>
-                      <a:ext cx="5972175" cy="1949450"/>
-                    </a:xfrm>
-                    <a:prstGeom prst="rect">
-                      <a:avLst/>
-                    </a:prstGeom>
-                  </pic:spPr>
-                </pic:pic>
-              </a:graphicData>
-            </a:graphic>
-            <wp14:sizeRelV relativeFrom="margin">
-              <wp14:pctHeight>0</wp14:pctHeight>
-            </wp14:sizeRelV>
-          </wp:anchor>
-        </w:drawing>
-      </w:r>
-      <w:r>
-        <w:rPr>
-          <w:noProof/>
-        </w:rPr>
         <mc:AlternateContent>
           <mc:Choice Requires="wps">
             <w:drawing>
-              <wp:anchor distT="0" distB="0" distL="114300" distR="114300" simplePos="0" relativeHeight="251788288" behindDoc="0" locked="0" layoutInCell="1" allowOverlap="1" wp14:anchorId="2D98B56A" wp14:editId="7D47DD30">
+              <wp:anchor distT="0" distB="0" distL="114300" distR="114300" simplePos="0" relativeHeight="251788288" behindDoc="0" locked="0" layoutInCell="1" allowOverlap="1" wp14:anchorId="2D98B56A" wp14:editId="595501C1">
                 <wp:simplePos x="0" y="0"/>
                 <wp:positionH relativeFrom="margin">
-                  <wp:align>center</wp:align>
+                  <wp:posOffset>1835150</wp:posOffset>
                 </wp:positionH>
                 <wp:positionV relativeFrom="paragraph">
-                  <wp:posOffset>4652845</wp:posOffset>
+                  <wp:posOffset>4921250</wp:posOffset>
                 </wp:positionV>
-                <wp:extent cx="2305050" cy="219075"/>
-                <wp:effectExtent l="0" t="0" r="0" b="9525"/>
+                <wp:extent cx="2305050" cy="267335"/>
+                <wp:effectExtent l="0" t="0" r="0" b="0"/>
                 <wp:wrapTopAndBottom/>
                 <wp:docPr id="1864228888" name="Text Box 1"/>
                 <wp:cNvGraphicFramePr/>
@@ -24055,7 +23992,7 @@
                       <wps:spPr>
                         <a:xfrm>
                           <a:off x="0" y="0"/>
-                          <a:ext cx="2305050" cy="219075"/>
+                          <a:ext cx="2305050" cy="267335"/>
                         </a:xfrm>
                         <a:prstGeom prst="rect">
                           <a:avLst/>
@@ -24080,7 +24017,7 @@
                                 <w:szCs w:val="26"/>
                               </w:rPr>
                             </w:pPr>
-                            <w:bookmarkStart w:id="174" w:name="_Toc214615945"/>
+                            <w:bookmarkStart w:id="175" w:name="_Toc214615945"/>
                             <w:r>
                               <w:rPr>
                                 <w:iCs w:val="0"/>
@@ -24145,7 +24082,7 @@
                               </w:rPr>
                               <w:t xml:space="preserve"> Bảng dữ liệu sản phẩm</w:t>
                             </w:r>
-                            <w:bookmarkEnd w:id="174"/>
+                            <w:bookmarkEnd w:id="175"/>
                           </w:p>
                         </w:txbxContent>
                       </wps:txbx>
@@ -24169,11 +24106,7 @@
           </mc:Choice>
           <mc:Fallback>
             <w:pict>
-              <v:shapetype w14:anchorId="2D98B56A" id="_x0000_t202" coordsize="21600,21600" o:spt="202" path="m,l,21600r21600,l21600,xe">
-                <v:stroke joinstyle="miter"/>
-                <v:path gradientshapeok="t" o:connecttype="rect"/>
-              </v:shapetype>
-              <v:shape id="_x0000_s1034" type="#_x0000_t202" style="position:absolute;margin-left:0;margin-top:366.35pt;width:181.5pt;height:17.25pt;z-index:251788288;visibility:visible;mso-wrap-style:square;mso-width-percent:0;mso-height-percent:0;mso-wrap-distance-left:9pt;mso-wrap-distance-top:0;mso-wrap-distance-right:9pt;mso-wrap-distance-bottom:0;mso-position-horizontal:center;mso-position-horizontal-relative:margin;mso-position-vertical:absolute;mso-position-vertical-relative:text;mso-width-percent:0;mso-height-percent:0;mso-width-relative:margin;mso-height-relative:margin;v-text-anchor:top" o:gfxdata="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" stroked="f">
+              <v:shape w14:anchorId="2D98B56A" id="_x0000_s1034" type="#_x0000_t202" style="position:absolute;left:0;text-align:left;margin-left:144.5pt;margin-top:387.5pt;width:181.5pt;height:21.05pt;z-index:251788288;visibility:visible;mso-wrap-style:square;mso-width-percent:0;mso-height-percent:0;mso-wrap-distance-left:9pt;mso-wrap-distance-top:0;mso-wrap-distance-right:9pt;mso-wrap-distance-bottom:0;mso-position-horizontal:absolute;mso-position-horizontal-relative:margin;mso-position-vertical:absolute;mso-position-vertical-relative:text;mso-width-percent:0;mso-height-percent:0;mso-width-relative:margin;mso-height-relative:margin;v-text-anchor:top" o:gfxdata="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" stroked="f">
                 <v:textbox inset="0,0,0,0">
                   <w:txbxContent>
                     <w:p>
@@ -24187,7 +24120,7 @@
                           <w:szCs w:val="26"/>
                         </w:rPr>
                       </w:pPr>
-                      <w:bookmarkStart w:id="175" w:name="_Toc214615945"/>
+                      <w:bookmarkStart w:id="176" w:name="_Toc214615945"/>
                       <w:r>
                         <w:rPr>
                           <w:iCs w:val="0"/>
@@ -24252,7 +24185,7 @@
                         </w:rPr>
                         <w:t xml:space="preserve"> Bảng dữ liệu sản phẩm</w:t>
                       </w:r>
-                      <w:bookmarkEnd w:id="175"/>
+                      <w:bookmarkEnd w:id="176"/>
                     </w:p>
                   </w:txbxContent>
                 </v:textbox>
@@ -24267,18 +24200,18 @@
           <w:noProof/>
         </w:rPr>
         <w:drawing>
-          <wp:anchor distT="0" distB="0" distL="114300" distR="114300" simplePos="0" relativeHeight="251781120" behindDoc="1" locked="0" layoutInCell="1" allowOverlap="1" wp14:anchorId="2FEF0889" wp14:editId="487175F1">
+          <wp:anchor distT="0" distB="0" distL="114300" distR="114300" simplePos="0" relativeHeight="251782144" behindDoc="0" locked="0" layoutInCell="1" allowOverlap="1" wp14:anchorId="4B1A97F9" wp14:editId="22C94C58">
             <wp:simplePos x="0" y="0"/>
             <wp:positionH relativeFrom="margin">
-              <wp:align>left</wp:align>
+              <wp:posOffset>-4445</wp:posOffset>
             </wp:positionH>
             <wp:positionV relativeFrom="page">
-              <wp:posOffset>709930</wp:posOffset>
+              <wp:posOffset>3544714</wp:posOffset>
             </wp:positionV>
-            <wp:extent cx="5972175" cy="1957070"/>
-            <wp:effectExtent l="0" t="0" r="9525" b="5080"/>
+            <wp:extent cx="5972175" cy="1949450"/>
+            <wp:effectExtent l="0" t="0" r="9525" b="0"/>
             <wp:wrapTopAndBottom/>
-            <wp:docPr id="941183460" name="Picture 1"/>
+            <wp:docPr id="1778109843" name="Picture 1"/>
             <wp:cNvGraphicFramePr>
               <a:graphicFrameLocks xmlns:a="http://schemas.openxmlformats.org/drawingml/2006/main" noChangeAspect="1"/>
             </wp:cNvGraphicFramePr>
@@ -24286,11 +24219,11 @@
               <a:graphicData uri="http://schemas.openxmlformats.org/drawingml/2006/picture">
                 <pic:pic xmlns:pic="http://schemas.openxmlformats.org/drawingml/2006/picture">
                   <pic:nvPicPr>
-                    <pic:cNvPr id="941183460" name=""/>
+                    <pic:cNvPr id="1778109843" name=""/>
                     <pic:cNvPicPr/>
                   </pic:nvPicPr>
                   <pic:blipFill>
-                    <a:blip r:embed="rId14">
+                    <a:blip r:embed="rId13">
                       <a:extLst>
                         <a:ext uri="{28A0092B-C50C-407E-A947-70E740481C1C}">
                           <a14:useLocalDpi xmlns:a14="http://schemas.microsoft.com/office/drawing/2010/main" val="0"/>
@@ -24304,7 +24237,7 @@
                   <pic:spPr>
                     <a:xfrm>
                       <a:off x="0" y="0"/>
-                      <a:ext cx="5972175" cy="1957070"/>
+                      <a:ext cx="5972175" cy="1949450"/>
                     </a:xfrm>
                     <a:prstGeom prst="rect">
                       <a:avLst/>
@@ -24326,7 +24259,7 @@
         <mc:AlternateContent>
           <mc:Choice Requires="wps">
             <w:drawing>
-              <wp:anchor distT="0" distB="0" distL="114300" distR="114300" simplePos="0" relativeHeight="251786240" behindDoc="0" locked="0" layoutInCell="1" allowOverlap="1" wp14:anchorId="25942154" wp14:editId="5699E571">
+              <wp:anchor distT="0" distB="0" distL="114300" distR="114300" simplePos="0" relativeHeight="251786240" behindDoc="0" locked="0" layoutInCell="1" allowOverlap="1" wp14:anchorId="25942154" wp14:editId="7EEA422F">
                 <wp:simplePos x="0" y="0"/>
                 <wp:positionH relativeFrom="margin">
                   <wp:align>center</wp:align>
@@ -24334,8 +24267,8 @@
                 <wp:positionV relativeFrom="paragraph">
                   <wp:posOffset>2098302</wp:posOffset>
                 </wp:positionV>
-                <wp:extent cx="2085975" cy="203835"/>
-                <wp:effectExtent l="0" t="0" r="9525" b="5715"/>
+                <wp:extent cx="2085975" cy="287020"/>
+                <wp:effectExtent l="0" t="0" r="9525" b="0"/>
                 <wp:wrapTopAndBottom/>
                 <wp:docPr id="1956910546" name="Text Box 1"/>
                 <wp:cNvGraphicFramePr/>
@@ -24346,7 +24279,7 @@
                       <wps:spPr>
                         <a:xfrm>
                           <a:off x="0" y="0"/>
-                          <a:ext cx="2085975" cy="203835"/>
+                          <a:ext cx="2085975" cy="287079"/>
                         </a:xfrm>
                         <a:prstGeom prst="rect">
                           <a:avLst/>
@@ -24371,7 +24304,7 @@
                                 <w:szCs w:val="26"/>
                               </w:rPr>
                             </w:pPr>
-                            <w:bookmarkStart w:id="176" w:name="_Toc214615946"/>
+                            <w:bookmarkStart w:id="177" w:name="_Toc214615946"/>
                             <w:r>
                               <w:rPr>
                                 <w:iCs w:val="0"/>
@@ -24436,7 +24369,7 @@
                               </w:rPr>
                               <w:t xml:space="preserve"> Bảng dữ liệu đơn hàng</w:t>
                             </w:r>
-                            <w:bookmarkEnd w:id="176"/>
+                            <w:bookmarkEnd w:id="177"/>
                           </w:p>
                         </w:txbxContent>
                       </wps:txbx>
@@ -24460,7 +24393,7 @@
           </mc:Choice>
           <mc:Fallback>
             <w:pict>
-              <v:shape w14:anchorId="25942154" id="_x0000_s1035" type="#_x0000_t202" style="position:absolute;margin-left:0;margin-top:165.2pt;width:164.25pt;height:16.05pt;z-index:251786240;visibility:visible;mso-wrap-style:square;mso-width-percent:0;mso-height-percent:0;mso-wrap-distance-left:9pt;mso-wrap-distance-top:0;mso-wrap-distance-right:9pt;mso-wrap-distance-bottom:0;mso-position-horizontal:center;mso-position-horizontal-relative:margin;mso-position-vertical:absolute;mso-position-vertical-relative:text;mso-width-percent:0;mso-height-percent:0;mso-width-relative:margin;mso-height-relative:margin;v-text-anchor:top" o:gfxdata="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" stroked="f">
+              <v:shape w14:anchorId="25942154" id="_x0000_s1035" type="#_x0000_t202" style="position:absolute;left:0;text-align:left;margin-left:0;margin-top:165.2pt;width:164.25pt;height:22.6pt;z-index:251786240;visibility:visible;mso-wrap-style:square;mso-width-percent:0;mso-height-percent:0;mso-wrap-distance-left:9pt;mso-wrap-distance-top:0;mso-wrap-distance-right:9pt;mso-wrap-distance-bottom:0;mso-position-horizontal:center;mso-position-horizontal-relative:margin;mso-position-vertical:absolute;mso-position-vertical-relative:text;mso-width-percent:0;mso-height-percent:0;mso-width-relative:margin;mso-height-relative:margin;v-text-anchor:top" o:gfxdata="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" stroked="f">
                 <v:textbox inset="0,0,0,0">
                   <w:txbxContent>
                     <w:p>
@@ -24474,7 +24407,7 @@
                           <w:szCs w:val="26"/>
                         </w:rPr>
                       </w:pPr>
-                      <w:bookmarkStart w:id="177" w:name="_Toc214615946"/>
+                      <w:bookmarkStart w:id="178" w:name="_Toc214615946"/>
                       <w:r>
                         <w:rPr>
                           <w:iCs w:val="0"/>
@@ -24539,7 +24472,7 @@
                         </w:rPr>
                         <w:t xml:space="preserve"> Bảng dữ liệu đơn hàng</w:t>
                       </w:r>
-                      <w:bookmarkEnd w:id="177"/>
+                      <w:bookmarkEnd w:id="178"/>
                     </w:p>
                   </w:txbxContent>
                 </v:textbox>
@@ -24551,9 +24484,112 @@
       </w:r>
       <w:r>
         <w:rPr>
-          <w:rFonts w:cs="Times New Roman"/>
-          <w:szCs w:val="26"/>
-        </w:rPr>
+          <w:noProof/>
+        </w:rPr>
+        <w:drawing>
+          <wp:anchor distT="0" distB="0" distL="114300" distR="114300" simplePos="0" relativeHeight="251781120" behindDoc="1" locked="0" layoutInCell="1" allowOverlap="1" wp14:anchorId="2FEF0889" wp14:editId="6E66C746">
+            <wp:simplePos x="0" y="0"/>
+            <wp:positionH relativeFrom="margin">
+              <wp:align>left</wp:align>
+            </wp:positionH>
+            <wp:positionV relativeFrom="page">
+              <wp:posOffset>709930</wp:posOffset>
+            </wp:positionV>
+            <wp:extent cx="5972175" cy="1957070"/>
+            <wp:effectExtent l="0" t="0" r="9525" b="5080"/>
+            <wp:wrapTopAndBottom/>
+            <wp:docPr id="941183460" name="Picture 1"/>
+            <wp:cNvGraphicFramePr>
+              <a:graphicFrameLocks xmlns:a="http://schemas.openxmlformats.org/drawingml/2006/main" noChangeAspect="1"/>
+            </wp:cNvGraphicFramePr>
+            <a:graphic xmlns:a="http://schemas.openxmlformats.org/drawingml/2006/main">
+              <a:graphicData uri="http://schemas.openxmlformats.org/drawingml/2006/picture">
+                <pic:pic xmlns:pic="http://schemas.openxmlformats.org/drawingml/2006/picture">
+                  <pic:nvPicPr>
+                    <pic:cNvPr id="941183460" name=""/>
+                    <pic:cNvPicPr/>
+                  </pic:nvPicPr>
+                  <pic:blipFill>
+                    <a:blip r:embed="rId14">
+                      <a:extLst>
+                        <a:ext uri="{28A0092B-C50C-407E-A947-70E740481C1C}">
+                          <a14:useLocalDpi xmlns:a14="http://schemas.microsoft.com/office/drawing/2010/main" val="0"/>
+                        </a:ext>
+                      </a:extLst>
+                    </a:blip>
+                    <a:stretch>
+                      <a:fillRect/>
+                    </a:stretch>
+                  </pic:blipFill>
+                  <pic:spPr>
+                    <a:xfrm>
+                      <a:off x="0" y="0"/>
+                      <a:ext cx="5972175" cy="1957070"/>
+                    </a:xfrm>
+                    <a:prstGeom prst="rect">
+                      <a:avLst/>
+                    </a:prstGeom>
+                  </pic:spPr>
+                </pic:pic>
+              </a:graphicData>
+            </a:graphic>
+            <wp14:sizeRelV relativeFrom="margin">
+              <wp14:pctHeight>0</wp14:pctHeight>
+            </wp14:sizeRelV>
+          </wp:anchor>
+        </w:drawing>
+      </w:r>
+      <w:r>
+        <w:t xml:space="preserve">- Bảng dữ liệu đơn hàng lưu trữ các thông tin đơn hàng của khách hàng, người dùng. </w:t>
+      </w:r>
+    </w:p>
+    <w:p>
+      <w:pPr>
+        <w:pStyle w:val="BaoCao"/>
+      </w:pPr>
+      <w:r>
+        <w:t>- Bảng dữ liệu sản phẩm là nơi lưu trữ các thông tin của sản phẩm</w:t>
+      </w:r>
+      <w:r>
+        <w:t xml:space="preserve"> như</w:t>
+      </w:r>
+      <w:r>
+        <w:t>: tên sản phẩm, giá, mô tả, hình ảnh …</w:t>
+      </w:r>
+      <w:r>
+        <w:t xml:space="preserve">, do người quản trị viên quản lý, dữ liệu sẽ được </w:t>
+      </w:r>
+      <w:r>
+        <w:t xml:space="preserve">truy xuất và </w:t>
+      </w:r>
+      <w:r>
+        <w:t xml:space="preserve">hiển thị lên các giao diện quản </w:t>
+      </w:r>
+      <w:r>
+        <w:t>lý</w:t>
+      </w:r>
+      <w:r>
+        <w:t xml:space="preserve"> hoặc thông tin </w:t>
+      </w:r>
+      <w:r>
+        <w:t xml:space="preserve">của sản phẩm </w:t>
+      </w:r>
+      <w:r>
+        <w:t xml:space="preserve">được hiển thị lên trang chủ để người dùng, khách hàng có thể </w:t>
+      </w:r>
+      <w:r>
+        <w:t xml:space="preserve">nhìn </w:t>
+      </w:r>
+      <w:r>
+        <w:t xml:space="preserve">thấy và </w:t>
+      </w:r>
+      <w:r>
+        <w:t>tương tác</w:t>
+      </w:r>
+      <w:r>
+        <w:t>.</w:t>
+      </w:r>
+      <w:r>
         <w:br w:type="page"/>
       </w:r>
     </w:p>
@@ -24565,7 +24601,7 @@
           <w:rFonts w:cs="Times New Roman"/>
         </w:rPr>
       </w:pPr>
-      <w:bookmarkStart w:id="178" w:name="_Toc214624491"/>
+      <w:bookmarkStart w:id="179" w:name="_Toc214624491"/>
       <w:r>
         <w:rPr>
           <w:rFonts w:cs="Times New Roman"/>
@@ -24685,7 +24721,7 @@
         </w:rPr>
         <w:t>CỨU</w:t>
       </w:r>
-      <w:bookmarkEnd w:id="178"/>
+      <w:bookmarkEnd w:id="179"/>
     </w:p>
     <w:p>
       <w:pPr>
@@ -24697,7 +24733,7 @@
           <w:color w:val="000000"/>
         </w:rPr>
       </w:pPr>
-      <w:bookmarkStart w:id="179" w:name="_Toc214624492"/>
+      <w:bookmarkStart w:id="180" w:name="_Toc214624492"/>
       <w:r>
         <w:rPr>
           <w:rFonts w:cs="Times New Roman"/>
@@ -24940,13 +24976,13 @@
         </w:rPr>
         <w:t>ề tài</w:t>
       </w:r>
-      <w:bookmarkEnd w:id="179"/>
+      <w:bookmarkEnd w:id="180"/>
     </w:p>
     <w:p>
       <w:pPr>
         <w:pStyle w:val="Heading3"/>
       </w:pPr>
-      <w:bookmarkStart w:id="180" w:name="_Toc214624493"/>
+      <w:bookmarkStart w:id="181" w:name="_Toc214624493"/>
       <w:r>
         <w:rPr>
           <w:spacing w:val="-2"/>
@@ -24981,7 +25017,7 @@
       <w:r>
         <w:t>.NET MVC</w:t>
       </w:r>
-      <w:bookmarkEnd w:id="180"/>
+      <w:bookmarkEnd w:id="181"/>
     </w:p>
     <w:p>
       <w:pPr>
@@ -24998,7 +25034,7 @@
           <w:szCs w:val="26"/>
         </w:rPr>
       </w:pPr>
-      <w:bookmarkStart w:id="181" w:name="_Toc214624494"/>
+      <w:bookmarkStart w:id="182" w:name="_Toc214624494"/>
       <w:r>
         <w:rPr>
           <w:rFonts w:cs="Times New Roman"/>
@@ -25245,7 +25281,7 @@
         </w:rPr>
         <w:t>VC</w:t>
       </w:r>
-      <w:bookmarkEnd w:id="181"/>
+      <w:bookmarkEnd w:id="182"/>
     </w:p>
     <w:p>
       <w:pPr>
@@ -25305,7 +25341,7 @@
                                 <w:szCs w:val="26"/>
                               </w:rPr>
                             </w:pPr>
-                            <w:bookmarkStart w:id="182" w:name="_Toc214615947"/>
+                            <w:bookmarkStart w:id="183" w:name="_Toc214615947"/>
                             <w:r>
                               <w:rPr>
                                 <w:iCs w:val="0"/>
@@ -25370,7 +25406,7 @@
                               </w:rPr>
                               <w:t xml:space="preserve"> Bước 1 - Tạo Project mới trên Visual Studio</w:t>
                             </w:r>
-                            <w:bookmarkEnd w:id="182"/>
+                            <w:bookmarkEnd w:id="183"/>
                           </w:p>
                         </w:txbxContent>
                       </wps:txbx>
@@ -26126,7 +26162,7 @@
                                 <w:szCs w:val="26"/>
                               </w:rPr>
                             </w:pPr>
-                            <w:bookmarkStart w:id="186" w:name="_Toc214615949"/>
+                            <w:bookmarkStart w:id="185" w:name="_Toc214615949"/>
                             <w:r>
                               <w:rPr>
                                 <w:iCs w:val="0"/>
@@ -26191,7 +26227,7 @@
                               </w:rPr>
                               <w:t xml:space="preserve"> Bước 3 – Đặt tên cho Project và đường dẫn lưu</w:t>
                             </w:r>
-                            <w:bookmarkEnd w:id="186"/>
+                            <w:bookmarkEnd w:id="185"/>
                           </w:p>
                         </w:txbxContent>
                       </wps:txbx>
@@ -26304,9 +26340,9 @@
         <w:t>Bước 4: Nhấn “Create” để tiếp tục</w:t>
       </w:r>
     </w:p>
-    <w:bookmarkStart w:id="187" w:name="_Toc214361029"/>
-    <w:bookmarkStart w:id="188" w:name="_Toc214361282"/>
-    <w:bookmarkStart w:id="189" w:name="_Toc214361943"/>
+    <w:bookmarkStart w:id="186" w:name="_Toc214361029"/>
+    <w:bookmarkStart w:id="187" w:name="_Toc214361282"/>
+    <w:bookmarkStart w:id="188" w:name="_Toc214361943"/>
     <w:p>
       <w:pPr>
         <w:spacing w:before="120" w:after="120" w:line="23" w:lineRule="atLeast"/>
@@ -26371,7 +26407,7 @@
                                 <w:szCs w:val="26"/>
                               </w:rPr>
                             </w:pPr>
-                            <w:bookmarkStart w:id="190" w:name="_Toc214615950"/>
+                            <w:bookmarkStart w:id="189" w:name="_Toc214615950"/>
                             <w:r>
                               <w:rPr>
                                 <w:iCs w:val="0"/>
@@ -26436,7 +26472,7 @@
                               </w:rPr>
                               <w:t xml:space="preserve"> Bước 4 – nhấn chọn Create</w:t>
                             </w:r>
-                            <w:bookmarkEnd w:id="190"/>
+                            <w:bookmarkEnd w:id="189"/>
                           </w:p>
                         </w:txbxContent>
                       </wps:txbx>
@@ -26551,9 +26587,9 @@
           </mc:Fallback>
         </mc:AlternateContent>
       </w:r>
+      <w:bookmarkEnd w:id="186"/>
       <w:bookmarkEnd w:id="187"/>
       <w:bookmarkEnd w:id="188"/>
-      <w:bookmarkEnd w:id="189"/>
     </w:p>
     <w:p>
       <w:pPr>
@@ -26564,6 +26600,7 @@
         </w:rPr>
       </w:pPr>
     </w:p>
+    <w:bookmarkStart w:id="190" w:name="_Toc214624495"/>
     <w:p>
       <w:pPr>
         <w:pStyle w:val="Heading4"/>
@@ -26575,7 +26612,6 @@
           <w:szCs w:val="26"/>
         </w:rPr>
       </w:pPr>
-      <w:bookmarkStart w:id="191" w:name="_Toc214624495"/>
       <w:r>
         <w:rPr>
           <w:rFonts w:cs="Times New Roman"/>
@@ -26633,7 +26669,7 @@
                                 <w:szCs w:val="26"/>
                               </w:rPr>
                             </w:pPr>
-                            <w:bookmarkStart w:id="192" w:name="_Toc214615951"/>
+                            <w:bookmarkStart w:id="191" w:name="_Toc214615951"/>
                             <w:r>
                               <w:rPr>
                                 <w:iCs w:val="0"/>
@@ -26698,7 +26734,7 @@
                               </w:rPr>
                               <w:t xml:space="preserve"> Giao diện làm việc và cấu trúc cây thư mục của ASP.NET MVC</w:t>
                             </w:r>
-                            <w:bookmarkEnd w:id="192"/>
+                            <w:bookmarkEnd w:id="191"/>
                           </w:p>
                         </w:txbxContent>
                       </wps:txbx>
@@ -26820,7 +26856,7 @@
           <w:szCs w:val="26"/>
         </w:rPr>
         <w:drawing>
-          <wp:anchor distT="0" distB="0" distL="114300" distR="114300" simplePos="0" relativeHeight="251657216" behindDoc="1" locked="0" layoutInCell="1" allowOverlap="1" wp14:anchorId="4B72388D" wp14:editId="1D563232">
+          <wp:anchor distT="0" distB="0" distL="114300" distR="114300" simplePos="0" relativeHeight="251657216" behindDoc="1" locked="0" layoutInCell="1" allowOverlap="1" wp14:anchorId="4B72388D" wp14:editId="6B684041">
             <wp:simplePos x="0" y="0"/>
             <wp:positionH relativeFrom="margin">
               <wp:align>center</wp:align>
@@ -27037,13 +27073,13 @@
         </w:rPr>
         <w:t>VC</w:t>
       </w:r>
-      <w:bookmarkEnd w:id="191"/>
+      <w:bookmarkEnd w:id="190"/>
     </w:p>
     <w:p>
       <w:pPr>
         <w:pStyle w:val="Heading3"/>
       </w:pPr>
-      <w:bookmarkStart w:id="194" w:name="_Toc214624496"/>
+      <w:bookmarkStart w:id="192" w:name="_Toc214624496"/>
       <w:r>
         <w:t>4</w:t>
       </w:r>
@@ -27068,13 +27104,13 @@
       <w:r>
         <w:t>Entity Framework</w:t>
       </w:r>
-      <w:bookmarkEnd w:id="194"/>
+      <w:bookmarkEnd w:id="192"/>
     </w:p>
     <w:p>
       <w:pPr>
         <w:pStyle w:val="Heading4"/>
       </w:pPr>
-      <w:bookmarkStart w:id="195" w:name="_Toc214624497"/>
+      <w:bookmarkStart w:id="193" w:name="_Toc214624497"/>
       <w:r>
         <w:t>4</w:t>
       </w:r>
@@ -27102,7 +27138,7 @@
       <w:r>
         <w:t xml:space="preserve"> Cài đặt Entity Framework cho dự án</w:t>
       </w:r>
-      <w:bookmarkEnd w:id="195"/>
+      <w:bookmarkEnd w:id="193"/>
     </w:p>
     <w:p>
       <w:pPr>
@@ -27162,7 +27198,7 @@
                                 <w:szCs w:val="26"/>
                               </w:rPr>
                             </w:pPr>
-                            <w:bookmarkStart w:id="196" w:name="_Toc214615952"/>
+                            <w:bookmarkStart w:id="194" w:name="_Toc214615952"/>
                             <w:r>
                               <w:rPr>
                                 <w:iCs w:val="0"/>
@@ -27227,7 +27263,7 @@
                               </w:rPr>
                               <w:t xml:space="preserve"> Package Manager Console sử dụng dòng lệnh</w:t>
                             </w:r>
-                            <w:bookmarkEnd w:id="196"/>
+                            <w:bookmarkEnd w:id="194"/>
                           </w:p>
                         </w:txbxContent>
                       </wps:txbx>
@@ -27465,7 +27501,7 @@
               </wp:anchor>
             </w:drawing>
           </mc:Choice>
-          <mc:Fallback xmlns:w16sdtfl="http://schemas.microsoft.com/office/word/2024/wordml/sdtformatlock" xmlns:w16sdtdh="http://schemas.microsoft.com/office/word/2020/wordml/sdtdatahash" xmlns:w16du="http://schemas.microsoft.com/office/word/2023/wordml/word16du" xmlns:w16="http://schemas.microsoft.com/office/word/2018/wordml" xmlns:w16cid="http://schemas.microsoft.com/office/word/2016/wordml/cid" xmlns:w16cex="http://schemas.microsoft.com/office/word/2018/wordml/cex" xmlns:oel="http://schemas.microsoft.com/office/2019/extlst" xmlns:am3d="http://schemas.microsoft.com/office/drawing/2017/model3d" xmlns:aink="http://schemas.microsoft.com/office/drawing/2016/ink" xmlns:cx8="http://schemas.microsoft.com/office/drawing/2016/5/14/chartex" xmlns:cx7="http://schemas.microsoft.com/office/drawing/2016/5/13/chartex" xmlns:cx6="http://schemas.microsoft.com/office/drawing/2016/5/12/chartex" xmlns:cx5="http://schemas.microsoft.com/office/drawing/2016/5/11/chartex" xmlns:cx4="http://schemas.microsoft.com/office/drawing/2016/5/10/chartex" xmlns:cx3="http://schemas.microsoft.com/office/drawing/2016/5/9/chartex" xmlns:cx2="http://schemas.microsoft.com/office/drawing/2015/10/21/chartex" xmlns:cx1="http://schemas.microsoft.com/office/drawing/2015/9/8/chartex">
+          <mc:Fallback>
             <w:pict>
               <v:shapetype w14:anchorId="694721F9" id="_x0000_t32" coordsize="21600,21600" o:spt="32" o:oned="t" path="m,l21600,21600e" filled="f">
                 <v:path arrowok="t" fillok="f" o:connecttype="none"/>
@@ -27535,7 +27571,7 @@
               </wp:anchor>
             </w:drawing>
           </mc:Choice>
-          <mc:Fallback xmlns:w16sdtfl="http://schemas.microsoft.com/office/word/2024/wordml/sdtformatlock" xmlns:w16sdtdh="http://schemas.microsoft.com/office/word/2020/wordml/sdtdatahash" xmlns:w16du="http://schemas.microsoft.com/office/word/2023/wordml/word16du" xmlns:w16="http://schemas.microsoft.com/office/word/2018/wordml" xmlns:w16cid="http://schemas.microsoft.com/office/word/2016/wordml/cid" xmlns:w16cex="http://schemas.microsoft.com/office/word/2018/wordml/cex" xmlns:oel="http://schemas.microsoft.com/office/2019/extlst" xmlns:am3d="http://schemas.microsoft.com/office/drawing/2017/model3d" xmlns:aink="http://schemas.microsoft.com/office/drawing/2016/ink" xmlns:cx8="http://schemas.microsoft.com/office/drawing/2016/5/14/chartex" xmlns:cx7="http://schemas.microsoft.com/office/drawing/2016/5/13/chartex" xmlns:cx6="http://schemas.microsoft.com/office/drawing/2016/5/12/chartex" xmlns:cx5="http://schemas.microsoft.com/office/drawing/2016/5/11/chartex" xmlns:cx4="http://schemas.microsoft.com/office/drawing/2016/5/10/chartex" xmlns:cx3="http://schemas.microsoft.com/office/drawing/2016/5/9/chartex" xmlns:cx2="http://schemas.microsoft.com/office/drawing/2015/10/21/chartex" xmlns:cx1="http://schemas.microsoft.com/office/drawing/2015/9/8/chartex">
+          <mc:Fallback>
             <w:pict>
               <v:shape w14:anchorId="6A539AC1" id="Straight Arrow Connector 20" o:spid="_x0000_s1026" type="#_x0000_t32" style="position:absolute;margin-left:89.25pt;margin-top:13.6pt;width:10.95pt;height:0;z-index:251651072;visibility:visible;mso-wrap-style:square;mso-wrap-distance-left:9pt;mso-wrap-distance-top:0;mso-wrap-distance-right:9pt;mso-wrap-distance-bottom:0;mso-position-horizontal:absolute;mso-position-horizontal-relative:text;mso-position-vertical:absolute;mso-position-vertical-relative:text" o:gfxdata="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" strokecolor="black [3200]" strokeweight=".5pt">
                 <v:stroke endarrow="block" joinstyle="miter"/>
@@ -27583,7 +27619,7 @@
           <w:rFonts w:cs="Times New Roman"/>
         </w:rPr>
       </w:pPr>
-      <w:bookmarkStart w:id="198" w:name="_Toc214624498"/>
+      <w:bookmarkStart w:id="195" w:name="_Toc214624498"/>
       <w:r>
         <w:rPr>
           <w:rFonts w:cs="Times New Roman"/>
@@ -27603,20 +27639,20 @@
         </w:rPr>
         <w:t>.2 Ứng dụng minh họa</w:t>
       </w:r>
-      <w:bookmarkEnd w:id="198"/>
+      <w:bookmarkEnd w:id="195"/>
     </w:p>
     <w:p>
       <w:pPr>
         <w:pStyle w:val="Heading3"/>
       </w:pPr>
-      <w:bookmarkStart w:id="199" w:name="_Toc214624499"/>
+      <w:bookmarkStart w:id="196" w:name="_Toc214624499"/>
       <w:r>
         <w:t>4</w:t>
       </w:r>
       <w:r>
         <w:t>.2.1 Mô tả bài toán</w:t>
       </w:r>
-      <w:bookmarkEnd w:id="199"/>
+      <w:bookmarkEnd w:id="196"/>
     </w:p>
     <w:p>
       <w:pPr>
@@ -27755,7 +27791,13 @@
         <w:pStyle w:val="BaoCao"/>
       </w:pPr>
       <w:r>
-        <w:t>Ngoài ra còn có một số chức năng như: Đăng kí, đăng nhập. Khách hàng có thể thay đổi mật khẩu</w:t>
+        <w:t>Ngoài ra còn có một số chức năng như: Đăng k</w:t>
+      </w:r>
+      <w:r>
+        <w:t>ý</w:t>
+      </w:r>
+      <w:r>
+        <w:t>, đăng nhập. Khách hàng có thể thay đổi mật khẩu</w:t>
       </w:r>
       <w:r>
         <w:t xml:space="preserve"> và ảnh đại diện</w:t>
@@ -27816,42 +27858,40 @@
       <w:r>
         <w:t>Tiếp nhận và kiểm tra đơn đặt hàng của khách hàng. Hiển thị đơn đặt hàng hay xóa bỏ đơn đặt hàng.</w:t>
       </w:r>
-    </w:p>
+      <w:r>
+        <w:t xml:space="preserve"> </w:t>
+      </w:r>
+      <w:r>
+        <w:t xml:space="preserve">Thống kê các sản phẩm đã bán, thống kê lượt truy cập. </w:t>
+      </w:r>
+    </w:p>
+    <w:p>
+      <w:pPr>
+        <w:pStyle w:val="Heading3"/>
+      </w:pPr>
+      <w:bookmarkStart w:id="197" w:name="_Toc214624500"/>
+      <w:r>
+        <w:t>4</w:t>
+      </w:r>
+      <w:r>
+        <w:t>.2.</w:t>
+      </w:r>
+      <w:r>
+        <w:t>2</w:t>
+      </w:r>
+      <w:r>
+        <w:t xml:space="preserve"> Thiết kế hệ thống</w:t>
+      </w:r>
+      <w:bookmarkEnd w:id="197"/>
+    </w:p>
+    <w:bookmarkStart w:id="198" w:name="_Toc214360101"/>
+    <w:bookmarkStart w:id="199" w:name="_Toc214361034"/>
+    <w:bookmarkStart w:id="200" w:name="_Toc214361287"/>
+    <w:bookmarkStart w:id="201" w:name="_Toc214361948"/>
     <w:p>
       <w:pPr>
         <w:pStyle w:val="BaoCao"/>
       </w:pPr>
-      <w:r>
-        <w:t xml:space="preserve">Thống kê các sản phẩm đã bán, thống kê lượt truy cập. </w:t>
-      </w:r>
-    </w:p>
-    <w:p>
-      <w:pPr>
-        <w:pStyle w:val="Heading3"/>
-      </w:pPr>
-      <w:bookmarkStart w:id="200" w:name="_Toc214624500"/>
-      <w:r>
-        <w:t>4</w:t>
-      </w:r>
-      <w:r>
-        <w:t>.2.</w:t>
-      </w:r>
-      <w:r>
-        <w:t>2</w:t>
-      </w:r>
-      <w:r>
-        <w:t xml:space="preserve"> Thiết kế hệ thống</w:t>
-      </w:r>
-      <w:bookmarkEnd w:id="200"/>
-    </w:p>
-    <w:p>
-      <w:pPr>
-        <w:pStyle w:val="BaoCao"/>
-      </w:pPr>
-      <w:bookmarkStart w:id="201" w:name="_Toc214360101"/>
-      <w:bookmarkStart w:id="202" w:name="_Toc214361034"/>
-      <w:bookmarkStart w:id="203" w:name="_Toc214361287"/>
-      <w:bookmarkStart w:id="204" w:name="_Toc214361948"/>
       <w:r>
         <w:rPr>
           <w:noProof/>
@@ -27906,7 +27946,7 @@
                                 <w:szCs w:val="26"/>
                               </w:rPr>
                             </w:pPr>
-                            <w:bookmarkStart w:id="205" w:name="_Toc214615953"/>
+                            <w:bookmarkStart w:id="202" w:name="_Toc214615953"/>
                             <w:r>
                               <w:rPr>
                                 <w:iCs w:val="0"/>
@@ -27971,7 +28011,7 @@
                               </w:rPr>
                               <w:t xml:space="preserve"> Mô hình ERD</w:t>
                             </w:r>
-                            <w:bookmarkEnd w:id="205"/>
+                            <w:bookmarkEnd w:id="202"/>
                           </w:p>
                         </w:txbxContent>
                       </wps:txbx>
@@ -28091,7 +28131,7 @@
           <w:noProof/>
         </w:rPr>
         <w:drawing>
-          <wp:anchor distT="0" distB="0" distL="114300" distR="114300" simplePos="0" relativeHeight="251745280" behindDoc="0" locked="0" layoutInCell="1" allowOverlap="1" wp14:anchorId="4CB38A94" wp14:editId="18E9152C">
+          <wp:anchor distT="0" distB="0" distL="114300" distR="114300" simplePos="0" relativeHeight="251745280" behindDoc="0" locked="0" layoutInCell="1" allowOverlap="1" wp14:anchorId="4CB38A94" wp14:editId="681BB359">
             <wp:simplePos x="0" y="0"/>
             <wp:positionH relativeFrom="margin">
               <wp:align>center</wp:align>
@@ -28146,71 +28186,71 @@
           </wp:anchor>
         </w:drawing>
       </w:r>
+      <w:bookmarkEnd w:id="198"/>
+      <w:bookmarkEnd w:id="199"/>
+      <w:bookmarkEnd w:id="200"/>
       <w:bookmarkEnd w:id="201"/>
-      <w:bookmarkEnd w:id="202"/>
+      <w:r>
+        <w:rPr>
+          <w:spacing w:val="-1"/>
+        </w:rPr>
+        <w:t>M</w:t>
+      </w:r>
+      <w:r>
+        <w:t>ô hình th</w:t>
+      </w:r>
+      <w:r>
+        <w:rPr>
+          <w:spacing w:val="-1"/>
+        </w:rPr>
+        <w:t>ự</w:t>
+      </w:r>
+      <w:r>
+        <w:t>c</w:t>
+      </w:r>
+      <w:r>
+        <w:rPr>
+          <w:spacing w:val="1"/>
+        </w:rPr>
+        <w:t xml:space="preserve"> </w:t>
+      </w:r>
+      <w:r>
+        <w:rPr>
+          <w:spacing w:val="1"/>
+        </w:rPr>
+        <w:t xml:space="preserve">thể quan hệ </w:t>
+      </w:r>
+      <w:r>
+        <w:t>ERD</w:t>
+      </w:r>
+      <w:r>
+        <w:t xml:space="preserve"> : Entity-Relationship </w:t>
+      </w:r>
+      <w:r>
+        <w:t>Diagram</w:t>
+      </w:r>
+      <w:r>
+        <w:t>, thể hiện các bảng dữ liệu và các ràng buộc quan hệ, tương tác giữa các bả</w:t>
+      </w:r>
+      <w:r>
+        <w:t>ng</w:t>
+      </w:r>
+      <w:r>
+        <w:t xml:space="preserve"> với nhau.</w:t>
+      </w:r>
+    </w:p>
+    <w:p>
+      <w:pPr>
+        <w:pStyle w:val="Heading3"/>
+      </w:pPr>
+      <w:bookmarkStart w:id="203" w:name="_Toc214624501"/>
+      <w:r>
+        <w:t>4</w:t>
+      </w:r>
+      <w:r>
+        <w:t>.2.3 Yêu cầu chức năng</w:t>
+      </w:r>
       <w:bookmarkEnd w:id="203"/>
-      <w:bookmarkEnd w:id="204"/>
-      <w:r>
-        <w:rPr>
-          <w:spacing w:val="-1"/>
-        </w:rPr>
-        <w:t>M</w:t>
-      </w:r>
-      <w:r>
-        <w:t>ô hình th</w:t>
-      </w:r>
-      <w:r>
-        <w:rPr>
-          <w:spacing w:val="-1"/>
-        </w:rPr>
-        <w:t>ự</w:t>
-      </w:r>
-      <w:r>
-        <w:t>c</w:t>
-      </w:r>
-      <w:r>
-        <w:rPr>
-          <w:spacing w:val="1"/>
-        </w:rPr>
-        <w:t xml:space="preserve"> </w:t>
-      </w:r>
-      <w:r>
-        <w:rPr>
-          <w:spacing w:val="1"/>
-        </w:rPr>
-        <w:t xml:space="preserve">thể quan hệ </w:t>
-      </w:r>
-      <w:r>
-        <w:t>ERD</w:t>
-      </w:r>
-      <w:r>
-        <w:t xml:space="preserve"> : Entity-Relationship </w:t>
-      </w:r>
-      <w:r>
-        <w:t>Diagram</w:t>
-      </w:r>
-      <w:r>
-        <w:t>, thể hiện các bảng dữ liệu và các ràng buộc quan hệ, tương tác giữa các bả</w:t>
-      </w:r>
-      <w:r>
-        <w:t>ng</w:t>
-      </w:r>
-      <w:r>
-        <w:t xml:space="preserve"> với nhau.</w:t>
-      </w:r>
-    </w:p>
-    <w:p>
-      <w:pPr>
-        <w:pStyle w:val="Heading3"/>
-      </w:pPr>
-      <w:bookmarkStart w:id="207" w:name="_Toc214624501"/>
-      <w:r>
-        <w:t>4</w:t>
-      </w:r>
-      <w:r>
-        <w:t>.2.3 Yêu cầu chức năng</w:t>
-      </w:r>
-      <w:bookmarkEnd w:id="207"/>
     </w:p>
     <w:p>
       <w:pPr>
@@ -28227,7 +28267,7 @@
           <w:szCs w:val="26"/>
         </w:rPr>
       </w:pPr>
-      <w:bookmarkStart w:id="208" w:name="_Toc214624502"/>
+      <w:bookmarkStart w:id="204" w:name="_Toc214624502"/>
       <w:r>
         <w:rPr>
           <w:rFonts w:cs="Times New Roman"/>
@@ -28250,7 +28290,7 @@
         </w:rPr>
         <w:t>.2.3.1 Chức năng nghiệp vụ</w:t>
       </w:r>
-      <w:bookmarkEnd w:id="208"/>
+      <w:bookmarkEnd w:id="204"/>
     </w:p>
     <w:p>
       <w:pPr>
@@ -28304,7 +28344,6 @@
         <w:rPr>
           <w:spacing w:val="-1"/>
         </w:rPr>
-        <w:lastRenderedPageBreak/>
         <w:t>T</w:t>
       </w:r>
       <w:r>
@@ -28324,6 +28363,7 @@
         <w:rPr>
           <w:spacing w:val="-1"/>
         </w:rPr>
+        <w:lastRenderedPageBreak/>
         <w:t>T</w:t>
       </w:r>
       <w:r>
@@ -28613,7 +28653,7 @@
           <w:szCs w:val="26"/>
         </w:rPr>
       </w:pPr>
-      <w:bookmarkStart w:id="209" w:name="_Toc214624503"/>
+      <w:bookmarkStart w:id="205" w:name="_Toc214624503"/>
       <w:r>
         <w:rPr>
           <w:rFonts w:cs="Times New Roman"/>
@@ -28636,7 +28676,7 @@
         </w:rPr>
         <w:t>.2.3.2 Chức năng hệ thống</w:t>
       </w:r>
-      <w:bookmarkEnd w:id="209"/>
+      <w:bookmarkEnd w:id="205"/>
     </w:p>
     <w:p>
       <w:pPr>
@@ -28763,16 +28803,16 @@
           <w:noProof/>
         </w:rPr>
         <w:drawing>
-          <wp:anchor distT="0" distB="0" distL="114300" distR="114300" simplePos="0" relativeHeight="251746304" behindDoc="0" locked="0" layoutInCell="1" allowOverlap="1" wp14:anchorId="5270E35E" wp14:editId="135E3F72">
+          <wp:anchor distT="0" distB="0" distL="114300" distR="114300" simplePos="0" relativeHeight="251746304" behindDoc="0" locked="0" layoutInCell="1" allowOverlap="1" wp14:anchorId="5270E35E" wp14:editId="1359B238">
             <wp:simplePos x="0" y="0"/>
             <wp:positionH relativeFrom="margin">
-              <wp:align>center</wp:align>
+              <wp:posOffset>462280</wp:posOffset>
             </wp:positionH>
             <wp:positionV relativeFrom="paragraph">
-              <wp:posOffset>228349</wp:posOffset>
+              <wp:posOffset>277495</wp:posOffset>
             </wp:positionV>
-            <wp:extent cx="4680000" cy="2925477"/>
-            <wp:effectExtent l="0" t="0" r="6350" b="8255"/>
+            <wp:extent cx="5040000" cy="3150403"/>
+            <wp:effectExtent l="0" t="0" r="8255" b="0"/>
             <wp:wrapTopAndBottom/>
             <wp:docPr id="1081039311" name="Picture 1"/>
             <wp:cNvGraphicFramePr>
@@ -28800,7 +28840,7 @@
                   <pic:spPr>
                     <a:xfrm>
                       <a:off x="0" y="0"/>
-                      <a:ext cx="4680000" cy="2925477"/>
+                      <a:ext cx="5040000" cy="3150403"/>
                     </a:xfrm>
                     <a:prstGeom prst="rect">
                       <a:avLst/>
@@ -28842,13 +28882,13 @@
         <mc:AlternateContent>
           <mc:Choice Requires="wps">
             <w:drawing>
-              <wp:anchor distT="0" distB="0" distL="114300" distR="114300" simplePos="0" relativeHeight="251748352" behindDoc="0" locked="0" layoutInCell="1" allowOverlap="1" wp14:anchorId="76F46115" wp14:editId="2D8CCC4B">
+              <wp:anchor distT="0" distB="0" distL="114300" distR="114300" simplePos="0" relativeHeight="251748352" behindDoc="0" locked="0" layoutInCell="1" allowOverlap="1" wp14:anchorId="76F46115" wp14:editId="103E9646">
                 <wp:simplePos x="0" y="0"/>
                 <wp:positionH relativeFrom="margin">
-                  <wp:posOffset>1767966</wp:posOffset>
+                  <wp:posOffset>1767840</wp:posOffset>
                 </wp:positionH>
                 <wp:positionV relativeFrom="paragraph">
-                  <wp:posOffset>2866841</wp:posOffset>
+                  <wp:posOffset>3147863</wp:posOffset>
                 </wp:positionV>
                 <wp:extent cx="2510155" cy="203835"/>
                 <wp:effectExtent l="0" t="0" r="4445" b="5715"/>
@@ -28889,7 +28929,7 @@
                                 <w:szCs w:val="26"/>
                               </w:rPr>
                             </w:pPr>
-                            <w:bookmarkStart w:id="210" w:name="_Toc214615954"/>
+                            <w:bookmarkStart w:id="206" w:name="_Toc214615954"/>
                             <w:r>
                               <w:rPr>
                                 <w:iCs w:val="0"/>
@@ -28954,7 +28994,7 @@
                               </w:rPr>
                               <w:t xml:space="preserve"> Sơ đồ User Case tổng quan</w:t>
                             </w:r>
-                            <w:bookmarkEnd w:id="210"/>
+                            <w:bookmarkEnd w:id="206"/>
                           </w:p>
                         </w:txbxContent>
                       </wps:txbx>
@@ -28978,7 +29018,11 @@
           </mc:Choice>
           <mc:Fallback>
             <w:pict>
-              <v:shape w14:anchorId="76F46115" id="_x0000_s1043" type="#_x0000_t202" style="position:absolute;margin-left:139.2pt;margin-top:225.75pt;width:197.65pt;height:16.05pt;z-index:251748352;visibility:visible;mso-wrap-style:square;mso-width-percent:0;mso-height-percent:0;mso-wrap-distance-left:9pt;mso-wrap-distance-top:0;mso-wrap-distance-right:9pt;mso-wrap-distance-bottom:0;mso-position-horizontal:absolute;mso-position-horizontal-relative:margin;mso-position-vertical:absolute;mso-position-vertical-relative:text;mso-width-percent:0;mso-height-percent:0;mso-width-relative:margin;mso-height-relative:margin;v-text-anchor:top" o:gfxdata="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" stroked="f">
+              <v:shapetype w14:anchorId="76F46115" id="_x0000_t202" coordsize="21600,21600" o:spt="202" path="m,l,21600r21600,l21600,xe">
+                <v:stroke joinstyle="miter"/>
+                <v:path gradientshapeok="t" o:connecttype="rect"/>
+              </v:shapetype>
+              <v:shape id="_x0000_s1043" type="#_x0000_t202" style="position:absolute;margin-left:139.2pt;margin-top:247.85pt;width:197.65pt;height:16.05pt;z-index:251748352;visibility:visible;mso-wrap-style:square;mso-width-percent:0;mso-height-percent:0;mso-wrap-distance-left:9pt;mso-wrap-distance-top:0;mso-wrap-distance-right:9pt;mso-wrap-distance-bottom:0;mso-position-horizontal:absolute;mso-position-horizontal-relative:margin;mso-position-vertical:absolute;mso-position-vertical-relative:text;mso-width-percent:0;mso-height-percent:0;mso-width-relative:margin;mso-height-relative:margin;v-text-anchor:top" o:gfxdata="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" stroked="f">
                 <v:textbox inset="0,0,0,0">
                   <w:txbxContent>
                     <w:p>
@@ -28994,7 +29038,7 @@
                           <w:szCs w:val="26"/>
                         </w:rPr>
                       </w:pPr>
-                      <w:bookmarkStart w:id="216" w:name="_Toc214615954"/>
+                      <w:bookmarkStart w:id="204" w:name="_Toc214615954"/>
                       <w:r>
                         <w:rPr>
                           <w:iCs w:val="0"/>
@@ -29059,7 +29103,7 @@
                         </w:rPr>
                         <w:t xml:space="preserve"> Sơ đồ User Case tổng quan</w:t>
                       </w:r>
-                      <w:bookmarkEnd w:id="216"/>
+                      <w:bookmarkEnd w:id="204"/>
                     </w:p>
                   </w:txbxContent>
                 </v:textbox>
@@ -29075,7 +29119,7 @@
         </w:rPr>
         <w:br w:type="page"/>
       </w:r>
-      <w:bookmarkStart w:id="211" w:name="_Toc214624504"/>
+      <w:bookmarkStart w:id="207" w:name="_Toc214624504"/>
       <w:r>
         <w:rPr>
           <w:spacing w:val="-2"/>
@@ -29146,7 +29190,7 @@
         </w:rPr>
         <w:t>n</w:t>
       </w:r>
-      <w:bookmarkEnd w:id="211"/>
+      <w:bookmarkEnd w:id="207"/>
     </w:p>
     <w:p>
       <w:pPr>
@@ -29162,7 +29206,7 @@
           <w:szCs w:val="26"/>
         </w:rPr>
       </w:pPr>
-      <w:bookmarkStart w:id="212" w:name="_Toc214624505"/>
+      <w:bookmarkStart w:id="208" w:name="_Toc214624505"/>
       <w:r>
         <w:rPr>
           <w:rFonts w:cs="Times New Roman"/>
@@ -29185,7 +29229,7 @@
         </w:rPr>
         <w:t>.2.4.1 Giao diện đăng nhập và đăng ký</w:t>
       </w:r>
-      <w:bookmarkEnd w:id="212"/>
+      <w:bookmarkEnd w:id="208"/>
     </w:p>
     <w:p>
       <w:pPr>
@@ -29270,7 +29314,7 @@
                                 <w:szCs w:val="26"/>
                               </w:rPr>
                             </w:pPr>
-                            <w:bookmarkStart w:id="213" w:name="_Toc214615955"/>
+                            <w:bookmarkStart w:id="209" w:name="_Toc214615955"/>
                             <w:r>
                               <w:rPr>
                                 <w:iCs w:val="0"/>
@@ -29335,7 +29379,7 @@
                               </w:rPr>
                               <w:t xml:space="preserve"> Giao diện đăng ký tài khoản</w:t>
                             </w:r>
-                            <w:bookmarkEnd w:id="213"/>
+                            <w:bookmarkEnd w:id="209"/>
                           </w:p>
                         </w:txbxContent>
                       </wps:txbx>
@@ -29533,10 +29577,8 @@
       <w:r>
         <w:t xml:space="preserve"> Người dùng cần đăng ký tài khoản trước khi thực hiện mua sắm, các thông tin cần nhập vào form như: họ tên, tên đăng nhập, địa chỉ email, mật khẩu và xác nhận lại đúng mật khẩu.</w:t>
       </w:r>
-      <w:bookmarkStart w:id="214" w:name="_GoBack"/>
-      <w:bookmarkEnd w:id="214"/>
-    </w:p>
-    <w:bookmarkStart w:id="215" w:name="_Toc214624506"/>
+    </w:p>
+    <w:bookmarkStart w:id="210" w:name="_Toc214624506"/>
     <w:p>
       <w:pPr>
         <w:pStyle w:val="Heading4"/>
@@ -29598,7 +29640,7 @@
                                 <w:szCs w:val="26"/>
                               </w:rPr>
                             </w:pPr>
-                            <w:bookmarkStart w:id="216" w:name="_Toc214615956"/>
+                            <w:bookmarkStart w:id="211" w:name="_Toc214615956"/>
                             <w:r>
                               <w:rPr>
                                 <w:iCs w:val="0"/>
@@ -29663,7 +29705,7 @@
                               </w:rPr>
                               <w:t xml:space="preserve"> Giao diện trang quản trị</w:t>
                             </w:r>
-                            <w:bookmarkEnd w:id="216"/>
+                            <w:bookmarkEnd w:id="211"/>
                           </w:p>
                         </w:txbxContent>
                       </wps:txbx>
@@ -29947,7 +29989,7 @@
                                 <w:szCs w:val="26"/>
                               </w:rPr>
                             </w:pPr>
-                            <w:bookmarkStart w:id="217" w:name="_Toc214615957"/>
+                            <w:bookmarkStart w:id="212" w:name="_Toc214615957"/>
                             <w:r>
                               <w:rPr>
                                 <w:color w:val="000000" w:themeColor="text1"/>
@@ -30005,7 +30047,7 @@
                               </w:rPr>
                               <w:t xml:space="preserve"> Giao diện đăng nhập tài khoản</w:t>
                             </w:r>
-                            <w:bookmarkEnd w:id="217"/>
+                            <w:bookmarkEnd w:id="212"/>
                           </w:p>
                         </w:txbxContent>
                       </wps:txbx>
@@ -30115,7 +30157,7 @@
       <w:r>
         <w:t>.2.4.2 Giao diện trang quản trị</w:t>
       </w:r>
-      <w:bookmarkEnd w:id="215"/>
+      <w:bookmarkEnd w:id="210"/>
     </w:p>
     <w:p>
       <w:pPr>
@@ -30128,7 +30170,7 @@
         <w:t>Trang quản trị: Hiển thị các chức năng quản lý của Admin về tài khoản người dùng, sản phẩm, đơn hàng.</w:t>
       </w:r>
     </w:p>
-    <w:bookmarkStart w:id="218" w:name="_Toc214624507"/>
+    <w:bookmarkStart w:id="213" w:name="_Toc214624507"/>
     <w:p>
       <w:pPr>
         <w:pStyle w:val="Heading4"/>
@@ -30151,13 +30193,13 @@
         <mc:AlternateContent>
           <mc:Choice Requires="wps">
             <w:drawing>
-              <wp:anchor distT="0" distB="0" distL="114300" distR="114300" simplePos="0" relativeHeight="251757568" behindDoc="0" locked="0" layoutInCell="1" allowOverlap="1" wp14:anchorId="3B1AEA76" wp14:editId="3B54B2EF">
+              <wp:anchor distT="0" distB="0" distL="114300" distR="114300" simplePos="0" relativeHeight="251757568" behindDoc="0" locked="0" layoutInCell="1" allowOverlap="1" wp14:anchorId="3B1AEA76" wp14:editId="1944B4D5">
                 <wp:simplePos x="0" y="0"/>
                 <wp:positionH relativeFrom="margin">
                   <wp:posOffset>2040890</wp:posOffset>
                 </wp:positionH>
                 <wp:positionV relativeFrom="paragraph">
-                  <wp:posOffset>3806190</wp:posOffset>
+                  <wp:posOffset>3763058</wp:posOffset>
                 </wp:positionV>
                 <wp:extent cx="1994535" cy="248920"/>
                 <wp:effectExtent l="0" t="0" r="5715" b="0"/>
@@ -30199,7 +30241,7 @@
                                 <w:szCs w:val="26"/>
                               </w:rPr>
                             </w:pPr>
-                            <w:bookmarkStart w:id="219" w:name="_Toc214615958"/>
+                            <w:bookmarkStart w:id="214" w:name="_Toc214615958"/>
                             <w:r>
                               <w:rPr>
                                 <w:iCs w:val="0"/>
@@ -30264,7 +30306,7 @@
                               </w:rPr>
                               <w:t xml:space="preserve"> Giao diện trang chủ</w:t>
                             </w:r>
-                            <w:bookmarkEnd w:id="219"/>
+                            <w:bookmarkEnd w:id="214"/>
                           </w:p>
                         </w:txbxContent>
                       </wps:txbx>
@@ -30288,7 +30330,7 @@
           </mc:Choice>
           <mc:Fallback>
             <w:pict>
-              <v:shape w14:anchorId="3B1AEA76" id="_x0000_s1047" type="#_x0000_t202" style="position:absolute;margin-left:160.7pt;margin-top:299.7pt;width:157.05pt;height:19.6pt;z-index:251757568;visibility:visible;mso-wrap-style:square;mso-width-percent:0;mso-height-percent:0;mso-wrap-distance-left:9pt;mso-wrap-distance-top:0;mso-wrap-distance-right:9pt;mso-wrap-distance-bottom:0;mso-position-horizontal:absolute;mso-position-horizontal-relative:margin;mso-position-vertical:absolute;mso-position-vertical-relative:text;mso-width-percent:0;mso-height-percent:0;mso-width-relative:margin;mso-height-relative:margin;v-text-anchor:top" o:gfxdata="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" stroked="f">
+              <v:shape w14:anchorId="3B1AEA76" id="_x0000_s1047" type="#_x0000_t202" style="position:absolute;margin-left:160.7pt;margin-top:296.3pt;width:157.05pt;height:19.6pt;z-index:251757568;visibility:visible;mso-wrap-style:square;mso-width-percent:0;mso-height-percent:0;mso-wrap-distance-left:9pt;mso-wrap-distance-top:0;mso-wrap-distance-right:9pt;mso-wrap-distance-bottom:0;mso-position-horizontal:absolute;mso-position-horizontal-relative:margin;mso-position-vertical:absolute;mso-position-vertical-relative:text;mso-width-percent:0;mso-height-percent:0;mso-width-relative:margin;mso-height-relative:margin;v-text-anchor:top" o:gfxdata="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" stroked="f">
                 <v:textbox inset="0,0,0,0">
                   <w:txbxContent>
                     <w:p>
@@ -30305,7 +30347,7 @@
                           <w:szCs w:val="26"/>
                         </w:rPr>
                       </w:pPr>
-                      <w:bookmarkStart w:id="228" w:name="_Toc214615958"/>
+                      <w:bookmarkStart w:id="213" w:name="_Toc214615958"/>
                       <w:r>
                         <w:rPr>
                           <w:iCs w:val="0"/>
@@ -30370,7 +30412,7 @@
                         </w:rPr>
                         <w:t xml:space="preserve"> Giao diện trang chủ</w:t>
                       </w:r>
-                      <w:bookmarkEnd w:id="228"/>
+                      <w:bookmarkEnd w:id="213"/>
                     </w:p>
                   </w:txbxContent>
                 </v:textbox>
@@ -30464,9 +30506,9 @@
         </w:rPr>
         <w:t>.2.4.3 Giao diện trang chủ</w:t>
       </w:r>
-      <w:bookmarkEnd w:id="218"/>
-    </w:p>
-    <w:bookmarkStart w:id="220" w:name="_Toc214624508"/>
+      <w:bookmarkEnd w:id="213"/>
+    </w:p>
+    <w:bookmarkStart w:id="215" w:name="_Toc214624508"/>
     <w:p>
       <w:pPr>
         <w:pStyle w:val="Heading4"/>
@@ -30486,13 +30528,13 @@
         <mc:AlternateContent>
           <mc:Choice Requires="wps">
             <w:drawing>
-              <wp:anchor distT="0" distB="0" distL="114300" distR="114300" simplePos="0" relativeHeight="251759616" behindDoc="1" locked="0" layoutInCell="1" allowOverlap="1" wp14:anchorId="4D6D0507" wp14:editId="1FEC2494">
+              <wp:anchor distT="0" distB="0" distL="114300" distR="114300" simplePos="0" relativeHeight="251759616" behindDoc="1" locked="0" layoutInCell="1" allowOverlap="1" wp14:anchorId="4D6D0507" wp14:editId="70606823">
                 <wp:simplePos x="0" y="0"/>
                 <wp:positionH relativeFrom="margin">
                   <wp:posOffset>1020445</wp:posOffset>
                 </wp:positionH>
                 <wp:positionV relativeFrom="paragraph">
-                  <wp:posOffset>7658856</wp:posOffset>
+                  <wp:posOffset>7589723</wp:posOffset>
                 </wp:positionV>
                 <wp:extent cx="3808730" cy="203835"/>
                 <wp:effectExtent l="0" t="0" r="1270" b="5715"/>
@@ -30534,7 +30576,7 @@
                                 <w:szCs w:val="26"/>
                               </w:rPr>
                             </w:pPr>
-                            <w:bookmarkStart w:id="221" w:name="_Toc214615959"/>
+                            <w:bookmarkStart w:id="216" w:name="_Toc214615959"/>
                             <w:r>
                               <w:rPr>
                                 <w:iCs w:val="0"/>
@@ -30599,7 +30641,7 @@
                               </w:rPr>
                               <w:t xml:space="preserve"> Giao diện trang chỉnh sửa thông tin người dùng</w:t>
                             </w:r>
-                            <w:bookmarkEnd w:id="221"/>
+                            <w:bookmarkEnd w:id="216"/>
                           </w:p>
                         </w:txbxContent>
                       </wps:txbx>
@@ -30623,7 +30665,7 @@
           </mc:Choice>
           <mc:Fallback>
             <w:pict>
-              <v:shape w14:anchorId="4D6D0507" id="_x0000_s1048" type="#_x0000_t202" style="position:absolute;margin-left:80.35pt;margin-top:603.05pt;width:299.9pt;height:16.05pt;z-index:-251556864;visibility:visible;mso-wrap-style:square;mso-width-percent:0;mso-height-percent:0;mso-wrap-distance-left:9pt;mso-wrap-distance-top:0;mso-wrap-distance-right:9pt;mso-wrap-distance-bottom:0;mso-position-horizontal:absolute;mso-position-horizontal-relative:margin;mso-position-vertical:absolute;mso-position-vertical-relative:text;mso-width-percent:0;mso-height-percent:0;mso-width-relative:margin;mso-height-relative:margin;v-text-anchor:top" o:gfxdata="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" stroked="f">
+              <v:shape w14:anchorId="4D6D0507" id="_x0000_s1048" type="#_x0000_t202" style="position:absolute;margin-left:80.35pt;margin-top:597.6pt;width:299.9pt;height:16.05pt;z-index:-251556864;visibility:visible;mso-wrap-style:square;mso-width-percent:0;mso-height-percent:0;mso-wrap-distance-left:9pt;mso-wrap-distance-top:0;mso-wrap-distance-right:9pt;mso-wrap-distance-bottom:0;mso-position-horizontal:absolute;mso-position-horizontal-relative:margin;mso-position-vertical:absolute;mso-position-vertical-relative:text;mso-width-percent:0;mso-height-percent:0;mso-width-relative:margin;mso-height-relative:margin;v-text-anchor:top" o:gfxdata="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" stroked="f">
                 <v:textbox inset="0,0,0,0">
                   <w:txbxContent>
                     <w:p>
@@ -30640,7 +30682,7 @@
                           <w:szCs w:val="26"/>
                         </w:rPr>
                       </w:pPr>
-                      <w:bookmarkStart w:id="231" w:name="_Toc214615959"/>
+                      <w:bookmarkStart w:id="216" w:name="_Toc214615959"/>
                       <w:r>
                         <w:rPr>
                           <w:iCs w:val="0"/>
@@ -30705,7 +30747,7 @@
                         </w:rPr>
                         <w:t xml:space="preserve"> Giao diện trang chỉnh sửa thông tin người dùng</w:t>
                       </w:r>
-                      <w:bookmarkEnd w:id="231"/>
+                      <w:bookmarkEnd w:id="216"/>
                     </w:p>
                   </w:txbxContent>
                 </v:textbox>
@@ -30728,13 +30770,13 @@
           <w:szCs w:val="26"/>
         </w:rPr>
         <w:drawing>
-          <wp:anchor distT="0" distB="0" distL="114300" distR="114300" simplePos="0" relativeHeight="251663360" behindDoc="1" locked="0" layoutInCell="1" allowOverlap="1" wp14:anchorId="0C242AF1" wp14:editId="0C6B0B7F">
+          <wp:anchor distT="0" distB="0" distL="114300" distR="114300" simplePos="0" relativeHeight="251663360" behindDoc="1" locked="0" layoutInCell="1" allowOverlap="1" wp14:anchorId="0C242AF1" wp14:editId="378271A5">
             <wp:simplePos x="0" y="0"/>
             <wp:positionH relativeFrom="margin">
               <wp:posOffset>-635</wp:posOffset>
             </wp:positionH>
             <wp:positionV relativeFrom="page">
-              <wp:posOffset>5117334</wp:posOffset>
+              <wp:posOffset>5047818</wp:posOffset>
             </wp:positionV>
             <wp:extent cx="5972175" cy="3357880"/>
             <wp:effectExtent l="0" t="0" r="9525" b="0"/>
@@ -30821,7 +30863,7 @@
         </w:rPr>
         <w:t xml:space="preserve"> Giao diện trang chỉnh sửa thông tin người dùng</w:t>
       </w:r>
-      <w:bookmarkEnd w:id="220"/>
+      <w:bookmarkEnd w:id="215"/>
     </w:p>
     <w:p>
       <w:pPr>
@@ -30847,14 +30889,14 @@
       <w:pPr>
         <w:pStyle w:val="Heading4"/>
       </w:pPr>
-      <w:bookmarkStart w:id="222" w:name="_Toc214624509"/>
+      <w:bookmarkStart w:id="217" w:name="_Toc214624509"/>
       <w:r>
         <w:rPr>
           <w:noProof/>
         </w:rPr>
         <w:lastRenderedPageBreak/>
         <w:drawing>
-          <wp:anchor distT="0" distB="0" distL="114300" distR="114300" simplePos="0" relativeHeight="251664384" behindDoc="1" locked="0" layoutInCell="1" allowOverlap="1" wp14:anchorId="542D32D5" wp14:editId="56F6EC6D">
+          <wp:anchor distT="0" distB="0" distL="114300" distR="114300" simplePos="0" relativeHeight="251664384" behindDoc="1" locked="0" layoutInCell="1" allowOverlap="1" wp14:anchorId="542D32D5" wp14:editId="1FB46F39">
             <wp:simplePos x="0" y="0"/>
             <wp:positionH relativeFrom="margin">
               <wp:align>center</wp:align>
@@ -30962,7 +31004,7 @@
                                 <w:szCs w:val="26"/>
                               </w:rPr>
                             </w:pPr>
-                            <w:bookmarkStart w:id="223" w:name="_Toc214615960"/>
+                            <w:bookmarkStart w:id="218" w:name="_Toc214615960"/>
                             <w:r>
                               <w:rPr>
                                 <w:iCs w:val="0"/>
@@ -31027,7 +31069,7 @@
                               </w:rPr>
                               <w:t xml:space="preserve"> Giao diện quản lý sản phẩm</w:t>
                             </w:r>
-                            <w:bookmarkEnd w:id="223"/>
+                            <w:bookmarkEnd w:id="218"/>
                           </w:p>
                         </w:txbxContent>
                       </wps:txbx>
@@ -31153,7 +31195,7 @@
       <w:r>
         <w:t xml:space="preserve"> Giao diện quản lý thông tin sản phẩm</w:t>
       </w:r>
-      <w:bookmarkEnd w:id="222"/>
+      <w:bookmarkEnd w:id="217"/>
     </w:p>
     <w:p>
       <w:pPr>
@@ -31169,7 +31211,7 @@
           <w:szCs w:val="26"/>
         </w:rPr>
       </w:pPr>
-      <w:bookmarkStart w:id="225" w:name="_Toc214624510"/>
+      <w:bookmarkStart w:id="219" w:name="_Toc214624510"/>
       <w:r>
         <w:rPr>
           <w:rFonts w:cs="Times New Roman"/>
@@ -31183,15 +31225,15 @@
           <w:szCs w:val="26"/>
         </w:rPr>
         <w:drawing>
-          <wp:anchor distT="0" distB="0" distL="114300" distR="114300" simplePos="0" relativeHeight="251665408" behindDoc="1" locked="0" layoutInCell="1" allowOverlap="1" wp14:anchorId="5A8FFDB7" wp14:editId="55014953">
+          <wp:anchor distT="0" distB="0" distL="114300" distR="114300" simplePos="0" relativeHeight="251665408" behindDoc="1" locked="0" layoutInCell="1" allowOverlap="1" wp14:anchorId="5A8FFDB7" wp14:editId="5C55AF17">
             <wp:simplePos x="0" y="0"/>
             <wp:positionH relativeFrom="margin">
-              <wp:align>center</wp:align>
+              <wp:posOffset>106680</wp:posOffset>
             </wp:positionH>
             <wp:positionV relativeFrom="page">
-              <wp:posOffset>4964687</wp:posOffset>
+              <wp:posOffset>4892675</wp:posOffset>
             </wp:positionV>
-            <wp:extent cx="5760000" cy="3238584"/>
+            <wp:extent cx="5759450" cy="3165475"/>
             <wp:effectExtent l="0" t="0" r="0" b="0"/>
             <wp:wrapTopAndBottom/>
             <wp:docPr id="1593155300" name="Picture 1"/>
@@ -31220,7 +31262,7 @@
                   <pic:spPr>
                     <a:xfrm>
                       <a:off x="0" y="0"/>
-                      <a:ext cx="5760000" cy="3238584"/>
+                      <a:ext cx="5759450" cy="3165475"/>
                     </a:xfrm>
                     <a:prstGeom prst="rect">
                       <a:avLst/>
@@ -31245,13 +31287,13 @@
         <mc:AlternateContent>
           <mc:Choice Requires="wps">
             <w:drawing>
-              <wp:anchor distT="0" distB="0" distL="114300" distR="114300" simplePos="0" relativeHeight="251763712" behindDoc="0" locked="0" layoutInCell="1" allowOverlap="1" wp14:anchorId="43240D5C" wp14:editId="77AC96CD">
+              <wp:anchor distT="0" distB="0" distL="114300" distR="114300" simplePos="0" relativeHeight="251763712" behindDoc="0" locked="0" layoutInCell="1" allowOverlap="1" wp14:anchorId="43240D5C" wp14:editId="3CD8071A">
                 <wp:simplePos x="0" y="0"/>
                 <wp:positionH relativeFrom="margin">
                   <wp:posOffset>1546225</wp:posOffset>
                 </wp:positionH>
                 <wp:positionV relativeFrom="paragraph">
-                  <wp:posOffset>7379587</wp:posOffset>
+                  <wp:posOffset>7132367</wp:posOffset>
                 </wp:positionV>
                 <wp:extent cx="2879090" cy="203835"/>
                 <wp:effectExtent l="0" t="0" r="0" b="5715"/>
@@ -31293,7 +31335,7 @@
                                 <w:szCs w:val="26"/>
                               </w:rPr>
                             </w:pPr>
-                            <w:bookmarkStart w:id="226" w:name="_Toc214615961"/>
+                            <w:bookmarkStart w:id="220" w:name="_Toc214615961"/>
                             <w:r>
                               <w:rPr>
                                 <w:iCs w:val="0"/>
@@ -31358,7 +31400,7 @@
                               </w:rPr>
                               <w:t xml:space="preserve"> Giao diện sửa thông tin sản phẩm</w:t>
                             </w:r>
-                            <w:bookmarkEnd w:id="226"/>
+                            <w:bookmarkEnd w:id="220"/>
                           </w:p>
                         </w:txbxContent>
                       </wps:txbx>
@@ -31382,7 +31424,7 @@
           </mc:Choice>
           <mc:Fallback>
             <w:pict>
-              <v:shape w14:anchorId="43240D5C" id="_x0000_s1050" type="#_x0000_t202" style="position:absolute;margin-left:121.75pt;margin-top:581.05pt;width:226.7pt;height:16.05pt;z-index:251763712;visibility:visible;mso-wrap-style:square;mso-width-percent:0;mso-height-percent:0;mso-wrap-distance-left:9pt;mso-wrap-distance-top:0;mso-wrap-distance-right:9pt;mso-wrap-distance-bottom:0;mso-position-horizontal:absolute;mso-position-horizontal-relative:margin;mso-position-vertical:absolute;mso-position-vertical-relative:text;mso-width-percent:0;mso-height-percent:0;mso-width-relative:margin;mso-height-relative:margin;v-text-anchor:top" o:gfxdata="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" stroked="f">
+              <v:shape w14:anchorId="43240D5C" id="_x0000_s1050" type="#_x0000_t202" style="position:absolute;margin-left:121.75pt;margin-top:561.6pt;width:226.7pt;height:16.05pt;z-index:251763712;visibility:visible;mso-wrap-style:square;mso-width-percent:0;mso-height-percent:0;mso-wrap-distance-left:9pt;mso-wrap-distance-top:0;mso-wrap-distance-right:9pt;mso-wrap-distance-bottom:0;mso-position-horizontal:absolute;mso-position-horizontal-relative:margin;mso-position-vertical:absolute;mso-position-vertical-relative:text;mso-width-percent:0;mso-height-percent:0;mso-width-relative:margin;mso-height-relative:margin;v-text-anchor:top" o:gfxdata="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" stroked="f">
                 <v:textbox inset="0,0,0,0">
                   <w:txbxContent>
                     <w:p>
@@ -31399,7 +31441,7 @@
                           <w:szCs w:val="26"/>
                         </w:rPr>
                       </w:pPr>
-                      <w:bookmarkStart w:id="227" w:name="_Toc214615961"/>
+                      <w:bookmarkStart w:id="221" w:name="_Toc214615961"/>
                       <w:r>
                         <w:rPr>
                           <w:iCs w:val="0"/>
@@ -31464,7 +31506,7 @@
                         </w:rPr>
                         <w:t xml:space="preserve"> Giao diện sửa thông tin sản phẩm</w:t>
                       </w:r>
-                      <w:bookmarkEnd w:id="227"/>
+                      <w:bookmarkEnd w:id="221"/>
                     </w:p>
                   </w:txbxContent>
                 </v:textbox>
@@ -31518,7 +31560,7 @@
         </w:rPr>
         <w:t xml:space="preserve"> Giao diện sửa thông tin sản phẩm</w:t>
       </w:r>
-      <w:bookmarkEnd w:id="225"/>
+      <w:bookmarkEnd w:id="219"/>
     </w:p>
     <w:p>
       <w:pPr>
@@ -31531,7 +31573,16 @@
         <w:t xml:space="preserve">Quản trị viên </w:t>
       </w:r>
       <w:r>
-        <w:t xml:space="preserve">quản lý danh sách sản phẩm và </w:t>
+        <w:t xml:space="preserve">quản lý danh sách sản phẩm </w:t>
+      </w:r>
+      <w:r>
+        <w:t xml:space="preserve">thông </w:t>
+      </w:r>
+      <w:r>
+        <w:t xml:space="preserve">qua giao diện quản lý sản phẩm </w:t>
+      </w:r>
+      <w:r>
+        <w:t xml:space="preserve">và </w:t>
       </w:r>
       <w:r>
         <w:t xml:space="preserve">chọn </w:t>
@@ -31558,7 +31609,7 @@
         <w:br w:type="page"/>
       </w:r>
     </w:p>
-    <w:bookmarkStart w:id="228" w:name="_Toc214624511"/>
+    <w:bookmarkStart w:id="222" w:name="_Toc214624511"/>
     <w:p>
       <w:pPr>
         <w:pStyle w:val="Heading4"/>
@@ -31617,7 +31668,7 @@
                                 <w:szCs w:val="26"/>
                               </w:rPr>
                             </w:pPr>
-                            <w:bookmarkStart w:id="229" w:name="_Toc214615962"/>
+                            <w:bookmarkStart w:id="223" w:name="_Toc214615962"/>
                             <w:r>
                               <w:rPr>
                                 <w:iCs w:val="0"/>
@@ -31682,7 +31733,7 @@
                               </w:rPr>
                               <w:t xml:space="preserve"> Giao diện thêm mới sản phẩm</w:t>
                             </w:r>
-                            <w:bookmarkEnd w:id="229"/>
+                            <w:bookmarkEnd w:id="223"/>
                           </w:p>
                         </w:txbxContent>
                       </wps:txbx>
@@ -31801,7 +31852,7 @@
           <w:noProof/>
         </w:rPr>
         <w:drawing>
-          <wp:anchor distT="0" distB="0" distL="114300" distR="114300" simplePos="0" relativeHeight="251666432" behindDoc="1" locked="0" layoutInCell="1" allowOverlap="1" wp14:anchorId="2C4DE25A" wp14:editId="6518751B">
+          <wp:anchor distT="0" distB="0" distL="114300" distR="114300" simplePos="0" relativeHeight="251666432" behindDoc="1" locked="0" layoutInCell="1" allowOverlap="1" wp14:anchorId="2C4DE25A" wp14:editId="1EF12A7A">
             <wp:simplePos x="0" y="0"/>
             <wp:positionH relativeFrom="margin">
               <wp:align>center</wp:align>
@@ -31868,7 +31919,7 @@
       <w:r>
         <w:t xml:space="preserve"> Giao diện thêm mới sản phẩm</w:t>
       </w:r>
-      <w:bookmarkEnd w:id="228"/>
+      <w:bookmarkEnd w:id="222"/>
     </w:p>
     <w:p>
       <w:pPr>
@@ -31896,7 +31947,7 @@
           <w:szCs w:val="26"/>
         </w:rPr>
       </w:pPr>
-      <w:bookmarkStart w:id="230" w:name="_Toc214624512"/>
+      <w:bookmarkStart w:id="224" w:name="_Toc214624512"/>
       <w:r>
         <w:rPr>
           <w:rFonts w:cs="Times New Roman"/>
@@ -31910,7 +31961,7 @@
           <w:szCs w:val="26"/>
         </w:rPr>
         <w:drawing>
-          <wp:anchor distT="0" distB="0" distL="114300" distR="114300" simplePos="0" relativeHeight="251731968" behindDoc="1" locked="0" layoutInCell="1" allowOverlap="1" wp14:anchorId="7FDF3C38" wp14:editId="5CEC06A0">
+          <wp:anchor distT="0" distB="0" distL="114300" distR="114300" simplePos="0" relativeHeight="251731968" behindDoc="1" locked="0" layoutInCell="1" allowOverlap="1" wp14:anchorId="7FDF3C38" wp14:editId="37504EF0">
             <wp:simplePos x="0" y="0"/>
             <wp:positionH relativeFrom="margin">
               <wp:posOffset>196175</wp:posOffset>
@@ -32028,7 +32079,7 @@
                                 <w:szCs w:val="26"/>
                               </w:rPr>
                             </w:pPr>
-                            <w:bookmarkStart w:id="231" w:name="_Toc214615963"/>
+                            <w:bookmarkStart w:id="225" w:name="_Toc214615963"/>
                             <w:r>
                               <w:rPr>
                                 <w:iCs w:val="0"/>
@@ -32093,7 +32144,7 @@
                               </w:rPr>
                               <w:t xml:space="preserve"> Giao diện xem chi tiết sản phẩm</w:t>
                             </w:r>
-                            <w:bookmarkEnd w:id="231"/>
+                            <w:bookmarkEnd w:id="225"/>
                           </w:p>
                         </w:txbxContent>
                       </wps:txbx>
@@ -32253,7 +32304,7 @@
         </w:rPr>
         <w:t xml:space="preserve"> Giao diện chi tiết sản phẩm</w:t>
       </w:r>
-      <w:bookmarkEnd w:id="230"/>
+      <w:bookmarkEnd w:id="224"/>
     </w:p>
     <w:p>
       <w:pPr>
@@ -32263,7 +32314,7 @@
         <w:t>- Người dùng có thể chọn vào một sản phẩm ở trang chủ để xem các thông tin chi tiết.</w:t>
       </w:r>
     </w:p>
-    <w:bookmarkStart w:id="232" w:name="_Toc214624513"/>
+    <w:bookmarkStart w:id="226" w:name="_Toc214624513"/>
     <w:p>
       <w:pPr>
         <w:pStyle w:val="Heading4"/>
@@ -32334,7 +32385,7 @@
                                 <w:szCs w:val="26"/>
                               </w:rPr>
                             </w:pPr>
-                            <w:bookmarkStart w:id="233" w:name="_Toc214615964"/>
+                            <w:bookmarkStart w:id="227" w:name="_Toc214615964"/>
                             <w:r>
                               <w:rPr>
                                 <w:iCs w:val="0"/>
@@ -32399,7 +32450,7 @@
                               </w:rPr>
                               <w:t xml:space="preserve"> Giao diện quản lý thông tin đơn hàng</w:t>
                             </w:r>
-                            <w:bookmarkEnd w:id="233"/>
+                            <w:bookmarkEnd w:id="227"/>
                           </w:p>
                         </w:txbxContent>
                       </wps:txbx>
@@ -32528,7 +32579,7 @@
           <w:szCs w:val="26"/>
         </w:rPr>
         <w:drawing>
-          <wp:anchor distT="0" distB="0" distL="114300" distR="114300" simplePos="0" relativeHeight="251668480" behindDoc="1" locked="0" layoutInCell="1" allowOverlap="1" wp14:anchorId="4C97B9A6" wp14:editId="7A9570AF">
+          <wp:anchor distT="0" distB="0" distL="114300" distR="114300" simplePos="0" relativeHeight="251668480" behindDoc="1" locked="0" layoutInCell="1" allowOverlap="1" wp14:anchorId="4C97B9A6" wp14:editId="5870C452">
             <wp:simplePos x="0" y="0"/>
             <wp:positionH relativeFrom="margin">
               <wp:align>center</wp:align>
@@ -32635,9 +32686,9 @@
         </w:rPr>
         <w:t xml:space="preserve"> Giao diện quản lý thông tin đơn hàng</w:t>
       </w:r>
-      <w:bookmarkEnd w:id="232"/>
-    </w:p>
-    <w:bookmarkStart w:id="234" w:name="_Toc214624514"/>
+      <w:bookmarkEnd w:id="226"/>
+    </w:p>
+    <w:bookmarkStart w:id="228" w:name="_Toc214624514"/>
     <w:p>
       <w:pPr>
         <w:pStyle w:val="Heading4"/>
@@ -32705,7 +32756,7 @@
                                 <w:szCs w:val="26"/>
                               </w:rPr>
                             </w:pPr>
-                            <w:bookmarkStart w:id="235" w:name="_Toc214615965"/>
+                            <w:bookmarkStart w:id="229" w:name="_Toc214615965"/>
                             <w:r>
                               <w:rPr>
                                 <w:iCs w:val="0"/>
@@ -32770,7 +32821,7 @@
                               </w:rPr>
                               <w:t xml:space="preserve"> Giao diện tìm kiếm sản phẩm</w:t>
                             </w:r>
-                            <w:bookmarkEnd w:id="235"/>
+                            <w:bookmarkEnd w:id="229"/>
                           </w:p>
                         </w:txbxContent>
                       </wps:txbx>
@@ -32899,7 +32950,7 @@
           <w:szCs w:val="26"/>
         </w:rPr>
         <w:drawing>
-          <wp:anchor distT="0" distB="0" distL="114300" distR="114300" simplePos="0" relativeHeight="251729920" behindDoc="1" locked="0" layoutInCell="1" allowOverlap="1" wp14:anchorId="14576F3D" wp14:editId="40F5A8B9">
+          <wp:anchor distT="0" distB="0" distL="114300" distR="114300" simplePos="0" relativeHeight="251729920" behindDoc="1" locked="0" layoutInCell="1" allowOverlap="1" wp14:anchorId="14576F3D" wp14:editId="311A490A">
             <wp:simplePos x="0" y="0"/>
             <wp:positionH relativeFrom="margin">
               <wp:align>center</wp:align>
@@ -32998,7 +33049,7 @@
         </w:rPr>
         <w:t xml:space="preserve"> Giao diện tìm kiếm sản phẩm</w:t>
       </w:r>
-      <w:bookmarkEnd w:id="234"/>
+      <w:bookmarkEnd w:id="228"/>
     </w:p>
     <w:p>
       <w:pPr>
@@ -33008,7 +33059,7 @@
         <w:t>- Khách hàng có thể nhập từ khóa vào ô tìm kiếm và tìm kiếm các sản phẩm có liên quan để dễ dàng chọn lọc các sản phẩm theo nhu cầu.</w:t>
       </w:r>
     </w:p>
-    <w:bookmarkStart w:id="236" w:name="_Toc214624515"/>
+    <w:bookmarkStart w:id="230" w:name="_Toc214624515"/>
     <w:p>
       <w:pPr>
         <w:pStyle w:val="Heading4"/>
@@ -33077,7 +33128,7 @@
                                 <w:szCs w:val="26"/>
                               </w:rPr>
                             </w:pPr>
-                            <w:bookmarkStart w:id="237" w:name="_Toc214615966"/>
+                            <w:bookmarkStart w:id="231" w:name="_Toc214615966"/>
                             <w:r>
                               <w:rPr>
                                 <w:iCs w:val="0"/>
@@ -33142,7 +33193,7 @@
                               </w:rPr>
                               <w:t xml:space="preserve"> Giao diện giỏ hàng</w:t>
                             </w:r>
-                            <w:bookmarkEnd w:id="237"/>
+                            <w:bookmarkEnd w:id="231"/>
                           </w:p>
                         </w:txbxContent>
                       </wps:txbx>
@@ -33313,7 +33364,7 @@
         </w:rPr>
         <w:t xml:space="preserve"> Giao diện giỏ hàng</w:t>
       </w:r>
-      <w:bookmarkEnd w:id="236"/>
+      <w:bookmarkEnd w:id="230"/>
     </w:p>
     <w:p>
       <w:pPr>
@@ -33337,15 +33388,15 @@
           <w:szCs w:val="26"/>
         </w:rPr>
       </w:pPr>
-      <w:bookmarkStart w:id="238" w:name="_Toc214352010"/>
-      <w:bookmarkStart w:id="239" w:name="_Toc214360115"/>
-      <w:bookmarkStart w:id="240" w:name="_Toc214361050"/>
-      <w:bookmarkStart w:id="241" w:name="_Toc214361303"/>
-      <w:bookmarkStart w:id="242" w:name="_Toc214361965"/>
-      <w:bookmarkStart w:id="243" w:name="_Toc214363077"/>
-      <w:bookmarkStart w:id="244" w:name="_Toc214364288"/>
-      <w:bookmarkStart w:id="245" w:name="_Toc214367152"/>
-      <w:bookmarkStart w:id="246" w:name="_Toc214624516"/>
+      <w:bookmarkStart w:id="232" w:name="_Toc214352010"/>
+      <w:bookmarkStart w:id="233" w:name="_Toc214360115"/>
+      <w:bookmarkStart w:id="234" w:name="_Toc214361050"/>
+      <w:bookmarkStart w:id="235" w:name="_Toc214361303"/>
+      <w:bookmarkStart w:id="236" w:name="_Toc214361965"/>
+      <w:bookmarkStart w:id="237" w:name="_Toc214363077"/>
+      <w:bookmarkStart w:id="238" w:name="_Toc214364288"/>
+      <w:bookmarkStart w:id="239" w:name="_Toc214367152"/>
+      <w:bookmarkStart w:id="240" w:name="_Toc214624516"/>
       <w:r>
         <w:rPr>
           <w:rFonts w:cs="Times New Roman"/>
@@ -33359,7 +33410,7 @@
           <w:szCs w:val="26"/>
         </w:rPr>
         <w:drawing>
-          <wp:anchor distT="0" distB="0" distL="114300" distR="114300" simplePos="0" relativeHeight="251672576" behindDoc="1" locked="0" layoutInCell="1" allowOverlap="1" wp14:anchorId="4B6BBF60" wp14:editId="1EE679A7">
+          <wp:anchor distT="0" distB="0" distL="114300" distR="114300" simplePos="0" relativeHeight="251672576" behindDoc="1" locked="0" layoutInCell="1" allowOverlap="1" wp14:anchorId="4B6BBF60" wp14:editId="015B92C5">
             <wp:simplePos x="0" y="0"/>
             <wp:positionH relativeFrom="margin">
               <wp:align>center</wp:align>
@@ -33427,7 +33478,7 @@
           <w:szCs w:val="26"/>
         </w:rPr>
         <w:drawing>
-          <wp:anchor distT="0" distB="0" distL="114300" distR="114300" simplePos="0" relativeHeight="251730944" behindDoc="1" locked="0" layoutInCell="1" allowOverlap="1" wp14:anchorId="4ED1FEB9" wp14:editId="457A6805">
+          <wp:anchor distT="0" distB="0" distL="114300" distR="114300" simplePos="0" relativeHeight="251730944" behindDoc="1" locked="0" layoutInCell="1" allowOverlap="1" wp14:anchorId="4ED1FEB9" wp14:editId="6DEB9261">
             <wp:simplePos x="0" y="0"/>
             <wp:positionH relativeFrom="margin">
               <wp:align>center</wp:align>
@@ -33482,14 +33533,14 @@
           </wp:anchor>
         </w:drawing>
       </w:r>
+      <w:bookmarkEnd w:id="232"/>
+      <w:bookmarkEnd w:id="233"/>
+      <w:bookmarkEnd w:id="234"/>
+      <w:bookmarkEnd w:id="235"/>
+      <w:bookmarkEnd w:id="236"/>
+      <w:bookmarkEnd w:id="237"/>
       <w:bookmarkEnd w:id="238"/>
       <w:bookmarkEnd w:id="239"/>
-      <w:bookmarkEnd w:id="240"/>
-      <w:bookmarkEnd w:id="241"/>
-      <w:bookmarkEnd w:id="242"/>
-      <w:bookmarkEnd w:id="243"/>
-      <w:bookmarkEnd w:id="244"/>
-      <w:bookmarkEnd w:id="245"/>
       <w:r>
         <w:rPr>
           <w:rFonts w:cs="Times New Roman"/>
@@ -33545,9 +33596,9 @@
         </w:rPr>
         <w:t xml:space="preserve"> Giao diện trang liên hệ</w:t>
       </w:r>
-      <w:bookmarkEnd w:id="246"/>
-    </w:p>
-    <w:bookmarkStart w:id="247" w:name="_Toc214624517"/>
+      <w:bookmarkEnd w:id="240"/>
+    </w:p>
+    <w:bookmarkStart w:id="241" w:name="_Toc214624517"/>
     <w:p>
       <w:pPr>
         <w:spacing w:before="120" w:after="120" w:line="360" w:lineRule="auto"/>
@@ -33567,13 +33618,13 @@
         <mc:AlternateContent>
           <mc:Choice Requires="wps">
             <w:drawing>
-              <wp:anchor distT="0" distB="0" distL="114300" distR="114300" simplePos="0" relativeHeight="251776000" behindDoc="1" locked="0" layoutInCell="1" allowOverlap="1" wp14:anchorId="6CEB2866" wp14:editId="72B33F03">
+              <wp:anchor distT="0" distB="0" distL="114300" distR="114300" simplePos="0" relativeHeight="251776000" behindDoc="1" locked="0" layoutInCell="1" allowOverlap="1" wp14:anchorId="6CEB2866" wp14:editId="0AFF7FE6">
                 <wp:simplePos x="0" y="0"/>
                 <wp:positionH relativeFrom="margin">
-                  <wp:align>center</wp:align>
+                  <wp:posOffset>1881505</wp:posOffset>
                 </wp:positionH>
                 <wp:positionV relativeFrom="paragraph">
-                  <wp:posOffset>3382325</wp:posOffset>
+                  <wp:posOffset>3356131</wp:posOffset>
                 </wp:positionV>
                 <wp:extent cx="2209800" cy="203835"/>
                 <wp:effectExtent l="0" t="0" r="0" b="5715"/>
@@ -33615,7 +33666,7 @@
                                 <w:szCs w:val="26"/>
                               </w:rPr>
                             </w:pPr>
-                            <w:bookmarkStart w:id="248" w:name="_Toc214615967"/>
+                            <w:bookmarkStart w:id="242" w:name="_Toc214615967"/>
                             <w:r>
                               <w:rPr>
                                 <w:iCs w:val="0"/>
@@ -33680,7 +33731,7 @@
                               </w:rPr>
                               <w:t xml:space="preserve"> Giao diện trang liên hệ</w:t>
                             </w:r>
-                            <w:bookmarkEnd w:id="248"/>
+                            <w:bookmarkEnd w:id="242"/>
                           </w:p>
                         </w:txbxContent>
                       </wps:txbx>
@@ -33704,7 +33755,7 @@
           </mc:Choice>
           <mc:Fallback>
             <w:pict>
-              <v:shape w14:anchorId="6CEB2866" id="_x0000_s1056" type="#_x0000_t202" style="position:absolute;margin-left:0;margin-top:266.3pt;width:174pt;height:16.05pt;z-index:-251540480;visibility:visible;mso-wrap-style:square;mso-width-percent:0;mso-height-percent:0;mso-wrap-distance-left:9pt;mso-wrap-distance-top:0;mso-wrap-distance-right:9pt;mso-wrap-distance-bottom:0;mso-position-horizontal:center;mso-position-horizontal-relative:margin;mso-position-vertical:absolute;mso-position-vertical-relative:text;mso-width-percent:0;mso-height-percent:0;mso-width-relative:margin;mso-height-relative:margin;v-text-anchor:top" o:gfxdata="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" stroked="f">
+              <v:shape w14:anchorId="6CEB2866" id="_x0000_s1056" type="#_x0000_t202" style="position:absolute;margin-left:148.15pt;margin-top:264.25pt;width:174pt;height:16.05pt;z-index:-251540480;visibility:visible;mso-wrap-style:square;mso-width-percent:0;mso-height-percent:0;mso-wrap-distance-left:9pt;mso-wrap-distance-top:0;mso-wrap-distance-right:9pt;mso-wrap-distance-bottom:0;mso-position-horizontal:absolute;mso-position-horizontal-relative:margin;mso-position-vertical:absolute;mso-position-vertical-relative:text;mso-width-percent:0;mso-height-percent:0;mso-width-relative:margin;mso-height-relative:margin;v-text-anchor:top" o:gfxdata="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" stroked="f">
                 <v:textbox inset="0,0,0,0">
                   <w:txbxContent>
                     <w:p>
@@ -33721,7 +33772,7 @@
                           <w:szCs w:val="26"/>
                         </w:rPr>
                       </w:pPr>
-                      <w:bookmarkStart w:id="264" w:name="_Toc214615967"/>
+                      <w:bookmarkStart w:id="242" w:name="_Toc214615967"/>
                       <w:r>
                         <w:rPr>
                           <w:iCs w:val="0"/>
@@ -33786,7 +33837,7 @@
                         </w:rPr>
                         <w:t xml:space="preserve"> Giao diện trang liên hệ</w:t>
                       </w:r>
-                      <w:bookmarkEnd w:id="264"/>
+                      <w:bookmarkEnd w:id="242"/>
                     </w:p>
                   </w:txbxContent>
                 </v:textbox>
@@ -33808,8 +33859,8 @@
         <w:br w:type="page"/>
       </w:r>
     </w:p>
-    <w:bookmarkStart w:id="249" w:name="_Toc214364289"/>
-    <w:bookmarkStart w:id="250" w:name="_Toc214367153"/>
+    <w:bookmarkStart w:id="243" w:name="_Toc214364289"/>
+    <w:bookmarkStart w:id="244" w:name="_Toc214367153"/>
     <w:p>
       <w:pPr>
         <w:pStyle w:val="Heading4"/>
@@ -33880,7 +33931,7 @@
                                 <w:szCs w:val="26"/>
                               </w:rPr>
                             </w:pPr>
-                            <w:bookmarkStart w:id="251" w:name="_Toc214615968"/>
+                            <w:bookmarkStart w:id="245" w:name="_Toc214615968"/>
                             <w:r>
                               <w:rPr>
                                 <w:iCs w:val="0"/>
@@ -33945,7 +33996,7 @@
                               </w:rPr>
                               <w:t xml:space="preserve"> Giao diện trang Profile thông tin người dùng</w:t>
                             </w:r>
-                            <w:bookmarkEnd w:id="251"/>
+                            <w:bookmarkEnd w:id="245"/>
                           </w:p>
                         </w:txbxContent>
                       </wps:txbx>
@@ -34061,8 +34112,8 @@
           </mc:Fallback>
         </mc:AlternateContent>
       </w:r>
-      <w:bookmarkEnd w:id="249"/>
-      <w:bookmarkEnd w:id="250"/>
+      <w:bookmarkEnd w:id="243"/>
+      <w:bookmarkEnd w:id="244"/>
       <w:r>
         <w:rPr>
           <w:i/>
@@ -34164,7 +34215,7 @@
         </w:rPr>
         <w:t>rofile thông tin người dùng</w:t>
       </w:r>
-      <w:bookmarkEnd w:id="247"/>
+      <w:bookmarkEnd w:id="241"/>
     </w:p>
     <w:p>
       <w:pPr>
@@ -34191,7 +34242,7 @@
           <w:rFonts w:cs="Times New Roman"/>
         </w:rPr>
       </w:pPr>
-      <w:bookmarkStart w:id="252" w:name="_Toc214624518"/>
+      <w:bookmarkStart w:id="246" w:name="_Toc214624518"/>
       <w:r>
         <w:rPr>
           <w:rFonts w:cs="Times New Roman"/>
@@ -34225,7 +34276,7 @@
         </w:rPr>
         <w:t>G 5: KẾT LUẬN VÀ HƯỚNG PHÁT TRIỂN</w:t>
       </w:r>
-      <w:bookmarkEnd w:id="252"/>
+      <w:bookmarkEnd w:id="246"/>
     </w:p>
     <w:p>
       <w:pPr>
@@ -34234,7 +34285,7 @@
           <w:rFonts w:cs="Times New Roman"/>
         </w:rPr>
       </w:pPr>
-      <w:bookmarkStart w:id="253" w:name="_Toc214624519"/>
+      <w:bookmarkStart w:id="247" w:name="_Toc214624519"/>
       <w:r>
         <w:rPr>
           <w:rFonts w:cs="Times New Roman"/>
@@ -34269,7 +34320,7 @@
         </w:rPr>
         <w:t>Các kết quả đạt được</w:t>
       </w:r>
-      <w:bookmarkEnd w:id="253"/>
+      <w:bookmarkEnd w:id="247"/>
     </w:p>
     <w:p>
       <w:pPr>
@@ -34670,7 +34721,7 @@
           <w:rFonts w:cs="Times New Roman"/>
         </w:rPr>
       </w:pPr>
-      <w:bookmarkStart w:id="254" w:name="_Toc214624520"/>
+      <w:bookmarkStart w:id="248" w:name="_Toc214624520"/>
       <w:r>
         <w:rPr>
           <w:rFonts w:cs="Times New Roman"/>
@@ -34852,20 +34903,20 @@
         </w:rPr>
         <w:t>iển</w:t>
       </w:r>
-      <w:bookmarkEnd w:id="254"/>
+      <w:bookmarkEnd w:id="248"/>
     </w:p>
     <w:p>
       <w:pPr>
         <w:pStyle w:val="Heading3"/>
       </w:pPr>
-      <w:bookmarkStart w:id="255" w:name="_Toc214624521"/>
+      <w:bookmarkStart w:id="249" w:name="_Toc214624521"/>
       <w:r>
         <w:t xml:space="preserve">5.2.1 </w:t>
       </w:r>
       <w:r>
         <w:t>Hạn chế:</w:t>
       </w:r>
-      <w:bookmarkEnd w:id="255"/>
+      <w:bookmarkEnd w:id="249"/>
     </w:p>
     <w:p>
       <w:pPr>
@@ -34915,14 +34966,14 @@
       <w:pPr>
         <w:pStyle w:val="Heading3"/>
       </w:pPr>
-      <w:bookmarkStart w:id="256" w:name="_Toc214624522"/>
+      <w:bookmarkStart w:id="250" w:name="_Toc214624522"/>
       <w:r>
         <w:t xml:space="preserve">5.2.2 </w:t>
       </w:r>
       <w:r>
         <w:t>Hướng phát triển:</w:t>
       </w:r>
-      <w:bookmarkEnd w:id="256"/>
+      <w:bookmarkEnd w:id="250"/>
     </w:p>
     <w:p>
       <w:pPr>
@@ -35065,7 +35116,7 @@
           <w:bCs w:val="0"/>
         </w:rPr>
       </w:pPr>
-      <w:bookmarkStart w:id="257" w:name="_Toc214624523"/>
+      <w:bookmarkStart w:id="251" w:name="_Toc214624523"/>
       <w:r>
         <w:rPr>
           <w:rFonts w:eastAsia="Times New Roman" w:cs="Times New Roman"/>
@@ -35186,7 +35237,7 @@
         </w:rPr>
         <w:t>O</w:t>
       </w:r>
-      <w:bookmarkEnd w:id="257"/>
+      <w:bookmarkEnd w:id="251"/>
     </w:p>
     <w:p>
       <w:pPr>
@@ -35297,7 +35348,7 @@
 </file>
 
 <file path=word/endnotes.xml><?xml version="1.0" encoding="utf-8"?>
-<w:endnotes xmlns:wpc="http://schemas.microsoft.com/office/word/2010/wordprocessingCanvas" xmlns:cx="http://schemas.microsoft.com/office/drawing/2014/chartex" xmlns:mc="http://schemas.openxmlformats.org/markup-compatibility/2006" xmlns:o="urn:schemas-microsoft-com:office:office" xmlns:r="http://schemas.openxmlformats.org/officeDocument/2006/relationships" xmlns:m="http://schemas.openxmlformats.org/officeDocument/2006/math" xmlns:v="urn:schemas-microsoft-com:vml" xmlns:wp14="http://schemas.microsoft.com/office/word/2010/wordprocessingDrawing" xmlns:wp="http://schemas.openxmlformats.org/drawingml/2006/wordprocessingDrawing" xmlns:w10="urn:schemas-microsoft-com:office:word" xmlns:w="http://schemas.openxmlformats.org/wordprocessingml/2006/main" xmlns:w14="http://schemas.microsoft.com/office/word/2010/wordml" xmlns:w15="http://schemas.microsoft.com/office/word/2012/wordml" xmlns:w16se="http://schemas.microsoft.com/office/word/2015/wordml/symex" xmlns:wpg="http://schemas.microsoft.com/office/word/2010/wordprocessingGroup" xmlns:wpi="http://schemas.microsoft.com/office/word/2010/wordprocessingInk" xmlns:wne="http://schemas.microsoft.com/office/word/2006/wordml" xmlns:wps="http://schemas.microsoft.com/office/word/2010/wordprocessingShape" mc:Ignorable="w14 w15 w16se wp14">
+<w:endnotes xmlns:wpc="http://schemas.microsoft.com/office/word/2010/wordprocessingCanvas" xmlns:cx="http://schemas.microsoft.com/office/drawing/2014/chartex" xmlns:cx1="http://schemas.microsoft.com/office/drawing/2015/9/8/chartex" xmlns:cx2="http://schemas.microsoft.com/office/drawing/2015/10/21/chartex" xmlns:cx3="http://schemas.microsoft.com/office/drawing/2016/5/9/chartex" xmlns:cx4="http://schemas.microsoft.com/office/drawing/2016/5/10/chartex" xmlns:cx5="http://schemas.microsoft.com/office/drawing/2016/5/11/chartex" xmlns:cx6="http://schemas.microsoft.com/office/drawing/2016/5/12/chartex" xmlns:cx7="http://schemas.microsoft.com/office/drawing/2016/5/13/chartex" xmlns:cx8="http://schemas.microsoft.com/office/drawing/2016/5/14/chartex" xmlns:mc="http://schemas.openxmlformats.org/markup-compatibility/2006" xmlns:aink="http://schemas.microsoft.com/office/drawing/2016/ink" xmlns:am3d="http://schemas.microsoft.com/office/drawing/2017/model3d" xmlns:o="urn:schemas-microsoft-com:office:office" xmlns:oel="http://schemas.microsoft.com/office/2019/extlst" xmlns:r="http://schemas.openxmlformats.org/officeDocument/2006/relationships" xmlns:m="http://schemas.openxmlformats.org/officeDocument/2006/math" xmlns:v="urn:schemas-microsoft-com:vml" xmlns:wp14="http://schemas.microsoft.com/office/word/2010/wordprocessingDrawing" xmlns:wp="http://schemas.openxmlformats.org/drawingml/2006/wordprocessingDrawing" xmlns:w10="urn:schemas-microsoft-com:office:word" xmlns:w="http://schemas.openxmlformats.org/wordprocessingml/2006/main" xmlns:w14="http://schemas.microsoft.com/office/word/2010/wordml" xmlns:w15="http://schemas.microsoft.com/office/word/2012/wordml" xmlns:w16cex="http://schemas.microsoft.com/office/word/2018/wordml/cex" xmlns:w16cid="http://schemas.microsoft.com/office/word/2016/wordml/cid" xmlns:w16="http://schemas.microsoft.com/office/word/2018/wordml" xmlns:w16du="http://schemas.microsoft.com/office/word/2023/wordml/word16du" xmlns:w16sdtdh="http://schemas.microsoft.com/office/word/2020/wordml/sdtdatahash" xmlns:w16sdtfl="http://schemas.microsoft.com/office/word/2024/wordml/sdtformatlock" xmlns:w16se="http://schemas.microsoft.com/office/word/2015/wordml/symex" xmlns:wpg="http://schemas.microsoft.com/office/word/2010/wordprocessingGroup" xmlns:wpi="http://schemas.microsoft.com/office/word/2010/wordprocessingInk" xmlns:wne="http://schemas.microsoft.com/office/word/2006/wordml" xmlns:wps="http://schemas.microsoft.com/office/word/2010/wordprocessingShape" mc:Ignorable="w14 w15 w16se w16cid w16 w16cex w16sdtdh w16sdtfl w16du wp14">
   <w:endnote w:type="separator" w:id="-1">
     <w:p>
       <w:r>
@@ -35316,7 +35367,7 @@
 </file>
 
 <file path=word/footer1.xml><?xml version="1.0" encoding="utf-8"?>
-<w:ftr xmlns:wpc="http://schemas.microsoft.com/office/word/2010/wordprocessingCanvas" xmlns:cx="http://schemas.microsoft.com/office/drawing/2014/chartex" xmlns:mc="http://schemas.openxmlformats.org/markup-compatibility/2006" xmlns:o="urn:schemas-microsoft-com:office:office" xmlns:r="http://schemas.openxmlformats.org/officeDocument/2006/relationships" xmlns:m="http://schemas.openxmlformats.org/officeDocument/2006/math" xmlns:v="urn:schemas-microsoft-com:vml" xmlns:wp14="http://schemas.microsoft.com/office/word/2010/wordprocessingDrawing" xmlns:wp="http://schemas.openxmlformats.org/drawingml/2006/wordprocessingDrawing" xmlns:w10="urn:schemas-microsoft-com:office:word" xmlns:w="http://schemas.openxmlformats.org/wordprocessingml/2006/main" xmlns:w14="http://schemas.microsoft.com/office/word/2010/wordml" xmlns:w15="http://schemas.microsoft.com/office/word/2012/wordml" xmlns:w16se="http://schemas.microsoft.com/office/word/2015/wordml/symex" xmlns:wpg="http://schemas.microsoft.com/office/word/2010/wordprocessingGroup" xmlns:wpi="http://schemas.microsoft.com/office/word/2010/wordprocessingInk" xmlns:wne="http://schemas.microsoft.com/office/word/2006/wordml" xmlns:wps="http://schemas.microsoft.com/office/word/2010/wordprocessingShape" mc:Ignorable="w14 w15 w16se wp14">
+<w:ftr xmlns:wpc="http://schemas.microsoft.com/office/word/2010/wordprocessingCanvas" xmlns:cx="http://schemas.microsoft.com/office/drawing/2014/chartex" xmlns:cx1="http://schemas.microsoft.com/office/drawing/2015/9/8/chartex" xmlns:cx2="http://schemas.microsoft.com/office/drawing/2015/10/21/chartex" xmlns:cx3="http://schemas.microsoft.com/office/drawing/2016/5/9/chartex" xmlns:cx4="http://schemas.microsoft.com/office/drawing/2016/5/10/chartex" xmlns:cx5="http://schemas.microsoft.com/office/drawing/2016/5/11/chartex" xmlns:cx6="http://schemas.microsoft.com/office/drawing/2016/5/12/chartex" xmlns:cx7="http://schemas.microsoft.com/office/drawing/2016/5/13/chartex" xmlns:cx8="http://schemas.microsoft.com/office/drawing/2016/5/14/chartex" xmlns:mc="http://schemas.openxmlformats.org/markup-compatibility/2006" xmlns:aink="http://schemas.microsoft.com/office/drawing/2016/ink" xmlns:am3d="http://schemas.microsoft.com/office/drawing/2017/model3d" xmlns:o="urn:schemas-microsoft-com:office:office" xmlns:oel="http://schemas.microsoft.com/office/2019/extlst" xmlns:r="http://schemas.openxmlformats.org/officeDocument/2006/relationships" xmlns:m="http://schemas.openxmlformats.org/officeDocument/2006/math" xmlns:v="urn:schemas-microsoft-com:vml" xmlns:wp14="http://schemas.microsoft.com/office/word/2010/wordprocessingDrawing" xmlns:wp="http://schemas.openxmlformats.org/drawingml/2006/wordprocessingDrawing" xmlns:w10="urn:schemas-microsoft-com:office:word" xmlns:w="http://schemas.openxmlformats.org/wordprocessingml/2006/main" xmlns:w14="http://schemas.microsoft.com/office/word/2010/wordml" xmlns:w15="http://schemas.microsoft.com/office/word/2012/wordml" xmlns:w16cex="http://schemas.microsoft.com/office/word/2018/wordml/cex" xmlns:w16cid="http://schemas.microsoft.com/office/word/2016/wordml/cid" xmlns:w16="http://schemas.microsoft.com/office/word/2018/wordml" xmlns:w16du="http://schemas.microsoft.com/office/word/2023/wordml/word16du" xmlns:w16sdtdh="http://schemas.microsoft.com/office/word/2020/wordml/sdtdatahash" xmlns:w16sdtfl="http://schemas.microsoft.com/office/word/2024/wordml/sdtformatlock" xmlns:w16se="http://schemas.microsoft.com/office/word/2015/wordml/symex" xmlns:wpg="http://schemas.microsoft.com/office/word/2010/wordprocessingGroup" xmlns:wpi="http://schemas.microsoft.com/office/word/2010/wordprocessingInk" xmlns:wne="http://schemas.microsoft.com/office/word/2006/wordml" xmlns:wps="http://schemas.microsoft.com/office/word/2010/wordprocessingShape" mc:Ignorable="w14 w15 w16se w16cid w16 w16cex w16sdtdh w16sdtfl w16du wp14">
   <w:p>
     <w:pPr>
       <w:pStyle w:val="Footer"/>
@@ -35359,7 +35410,7 @@
 </file>
 
 <file path=word/footer2.xml><?xml version="1.0" encoding="utf-8"?>
-<w:ftr xmlns:wpc="http://schemas.microsoft.com/office/word/2010/wordprocessingCanvas" xmlns:cx="http://schemas.microsoft.com/office/drawing/2014/chartex" xmlns:mc="http://schemas.openxmlformats.org/markup-compatibility/2006" xmlns:o="urn:schemas-microsoft-com:office:office" xmlns:r="http://schemas.openxmlformats.org/officeDocument/2006/relationships" xmlns:m="http://schemas.openxmlformats.org/officeDocument/2006/math" xmlns:v="urn:schemas-microsoft-com:vml" xmlns:wp14="http://schemas.microsoft.com/office/word/2010/wordprocessingDrawing" xmlns:wp="http://schemas.openxmlformats.org/drawingml/2006/wordprocessingDrawing" xmlns:w10="urn:schemas-microsoft-com:office:word" xmlns:w="http://schemas.openxmlformats.org/wordprocessingml/2006/main" xmlns:w14="http://schemas.microsoft.com/office/word/2010/wordml" xmlns:w15="http://schemas.microsoft.com/office/word/2012/wordml" xmlns:w16se="http://schemas.microsoft.com/office/word/2015/wordml/symex" xmlns:wpg="http://schemas.microsoft.com/office/word/2010/wordprocessingGroup" xmlns:wpi="http://schemas.microsoft.com/office/word/2010/wordprocessingInk" xmlns:wne="http://schemas.microsoft.com/office/word/2006/wordml" xmlns:wps="http://schemas.microsoft.com/office/word/2010/wordprocessingShape" mc:Ignorable="w14 w15 w16se wp14">
+<w:ftr xmlns:wpc="http://schemas.microsoft.com/office/word/2010/wordprocessingCanvas" xmlns:cx="http://schemas.microsoft.com/office/drawing/2014/chartex" xmlns:cx1="http://schemas.microsoft.com/office/drawing/2015/9/8/chartex" xmlns:cx2="http://schemas.microsoft.com/office/drawing/2015/10/21/chartex" xmlns:cx3="http://schemas.microsoft.com/office/drawing/2016/5/9/chartex" xmlns:cx4="http://schemas.microsoft.com/office/drawing/2016/5/10/chartex" xmlns:cx5="http://schemas.microsoft.com/office/drawing/2016/5/11/chartex" xmlns:cx6="http://schemas.microsoft.com/office/drawing/2016/5/12/chartex" xmlns:cx7="http://schemas.microsoft.com/office/drawing/2016/5/13/chartex" xmlns:cx8="http://schemas.microsoft.com/office/drawing/2016/5/14/chartex" xmlns:mc="http://schemas.openxmlformats.org/markup-compatibility/2006" xmlns:aink="http://schemas.microsoft.com/office/drawing/2016/ink" xmlns:am3d="http://schemas.microsoft.com/office/drawing/2017/model3d" xmlns:o="urn:schemas-microsoft-com:office:office" xmlns:oel="http://schemas.microsoft.com/office/2019/extlst" xmlns:r="http://schemas.openxmlformats.org/officeDocument/2006/relationships" xmlns:m="http://schemas.openxmlformats.org/officeDocument/2006/math" xmlns:v="urn:schemas-microsoft-com:vml" xmlns:wp14="http://schemas.microsoft.com/office/word/2010/wordprocessingDrawing" xmlns:wp="http://schemas.openxmlformats.org/drawingml/2006/wordprocessingDrawing" xmlns:w10="urn:schemas-microsoft-com:office:word" xmlns:w="http://schemas.openxmlformats.org/wordprocessingml/2006/main" xmlns:w14="http://schemas.microsoft.com/office/word/2010/wordml" xmlns:w15="http://schemas.microsoft.com/office/word/2012/wordml" xmlns:w16cex="http://schemas.microsoft.com/office/word/2018/wordml/cex" xmlns:w16cid="http://schemas.microsoft.com/office/word/2016/wordml/cid" xmlns:w16="http://schemas.microsoft.com/office/word/2018/wordml" xmlns:w16du="http://schemas.microsoft.com/office/word/2023/wordml/word16du" xmlns:w16sdtdh="http://schemas.microsoft.com/office/word/2020/wordml/sdtdatahash" xmlns:w16sdtfl="http://schemas.microsoft.com/office/word/2024/wordml/sdtformatlock" xmlns:w16se="http://schemas.microsoft.com/office/word/2015/wordml/symex" xmlns:wpg="http://schemas.microsoft.com/office/word/2010/wordprocessingGroup" xmlns:wpi="http://schemas.microsoft.com/office/word/2010/wordprocessingInk" xmlns:wne="http://schemas.microsoft.com/office/word/2006/wordml" xmlns:wps="http://schemas.microsoft.com/office/word/2010/wordprocessingShape" mc:Ignorable="w14 w15 w16se w16cid w16 w16cex w16sdtdh w16sdtfl w16du wp14">
   <w:p>
     <w:pPr>
       <w:pStyle w:val="Footer"/>
@@ -35430,7 +35481,7 @@
 </file>
 
 <file path=word/footnotes.xml><?xml version="1.0" encoding="utf-8"?>
-<w:footnotes xmlns:wpc="http://schemas.microsoft.com/office/word/2010/wordprocessingCanvas" xmlns:cx="http://schemas.microsoft.com/office/drawing/2014/chartex" xmlns:mc="http://schemas.openxmlformats.org/markup-compatibility/2006" xmlns:o="urn:schemas-microsoft-com:office:office" xmlns:r="http://schemas.openxmlformats.org/officeDocument/2006/relationships" xmlns:m="http://schemas.openxmlformats.org/officeDocument/2006/math" xmlns:v="urn:schemas-microsoft-com:vml" xmlns:wp14="http://schemas.microsoft.com/office/word/2010/wordprocessingDrawing" xmlns:wp="http://schemas.openxmlformats.org/drawingml/2006/wordprocessingDrawing" xmlns:w10="urn:schemas-microsoft-com:office:word" xmlns:w="http://schemas.openxmlformats.org/wordprocessingml/2006/main" xmlns:w14="http://schemas.microsoft.com/office/word/2010/wordml" xmlns:w15="http://schemas.microsoft.com/office/word/2012/wordml" xmlns:w16se="http://schemas.microsoft.com/office/word/2015/wordml/symex" xmlns:wpg="http://schemas.microsoft.com/office/word/2010/wordprocessingGroup" xmlns:wpi="http://schemas.microsoft.com/office/word/2010/wordprocessingInk" xmlns:wne="http://schemas.microsoft.com/office/word/2006/wordml" xmlns:wps="http://schemas.microsoft.com/office/word/2010/wordprocessingShape" mc:Ignorable="w14 w15 w16se wp14">
+<w:footnotes xmlns:wpc="http://schemas.microsoft.com/office/word/2010/wordprocessingCanvas" xmlns:cx="http://schemas.microsoft.com/office/drawing/2014/chartex" xmlns:cx1="http://schemas.microsoft.com/office/drawing/2015/9/8/chartex" xmlns:cx2="http://schemas.microsoft.com/office/drawing/2015/10/21/chartex" xmlns:cx3="http://schemas.microsoft.com/office/drawing/2016/5/9/chartex" xmlns:cx4="http://schemas.microsoft.com/office/drawing/2016/5/10/chartex" xmlns:cx5="http://schemas.microsoft.com/office/drawing/2016/5/11/chartex" xmlns:cx6="http://schemas.microsoft.com/office/drawing/2016/5/12/chartex" xmlns:cx7="http://schemas.microsoft.com/office/drawing/2016/5/13/chartex" xmlns:cx8="http://schemas.microsoft.com/office/drawing/2016/5/14/chartex" xmlns:mc="http://schemas.openxmlformats.org/markup-compatibility/2006" xmlns:aink="http://schemas.microsoft.com/office/drawing/2016/ink" xmlns:am3d="http://schemas.microsoft.com/office/drawing/2017/model3d" xmlns:o="urn:schemas-microsoft-com:office:office" xmlns:oel="http://schemas.microsoft.com/office/2019/extlst" xmlns:r="http://schemas.openxmlformats.org/officeDocument/2006/relationships" xmlns:m="http://schemas.openxmlformats.org/officeDocument/2006/math" xmlns:v="urn:schemas-microsoft-com:vml" xmlns:wp14="http://schemas.microsoft.com/office/word/2010/wordprocessingDrawing" xmlns:wp="http://schemas.openxmlformats.org/drawingml/2006/wordprocessingDrawing" xmlns:w10="urn:schemas-microsoft-com:office:word" xmlns:w="http://schemas.openxmlformats.org/wordprocessingml/2006/main" xmlns:w14="http://schemas.microsoft.com/office/word/2010/wordml" xmlns:w15="http://schemas.microsoft.com/office/word/2012/wordml" xmlns:w16cex="http://schemas.microsoft.com/office/word/2018/wordml/cex" xmlns:w16cid="http://schemas.microsoft.com/office/word/2016/wordml/cid" xmlns:w16="http://schemas.microsoft.com/office/word/2018/wordml" xmlns:w16du="http://schemas.microsoft.com/office/word/2023/wordml/word16du" xmlns:w16sdtdh="http://schemas.microsoft.com/office/word/2020/wordml/sdtdatahash" xmlns:w16sdtfl="http://schemas.microsoft.com/office/word/2024/wordml/sdtformatlock" xmlns:w16se="http://schemas.microsoft.com/office/word/2015/wordml/symex" xmlns:wpg="http://schemas.microsoft.com/office/word/2010/wordprocessingGroup" xmlns:wpi="http://schemas.microsoft.com/office/word/2010/wordprocessingInk" xmlns:wne="http://schemas.microsoft.com/office/word/2006/wordml" xmlns:wps="http://schemas.microsoft.com/office/word/2010/wordprocessingShape" mc:Ignorable="w14 w15 w16se w16cid w16 w16cex w16sdtdh w16sdtfl w16du wp14">
   <w:footnote w:type="separator" w:id="-1">
     <w:p>
       <w:r>
@@ -35449,7 +35500,7 @@
 </file>
 
 <file path=word/header1.xml><?xml version="1.0" encoding="utf-8"?>
-<w:hdr xmlns:wpc="http://schemas.microsoft.com/office/word/2010/wordprocessingCanvas" xmlns:cx="http://schemas.microsoft.com/office/drawing/2014/chartex" xmlns:mc="http://schemas.openxmlformats.org/markup-compatibility/2006" xmlns:o="urn:schemas-microsoft-com:office:office" xmlns:r="http://schemas.openxmlformats.org/officeDocument/2006/relationships" xmlns:m="http://schemas.openxmlformats.org/officeDocument/2006/math" xmlns:v="urn:schemas-microsoft-com:vml" xmlns:wp14="http://schemas.microsoft.com/office/word/2010/wordprocessingDrawing" xmlns:wp="http://schemas.openxmlformats.org/drawingml/2006/wordprocessingDrawing" xmlns:w10="urn:schemas-microsoft-com:office:word" xmlns:w="http://schemas.openxmlformats.org/wordprocessingml/2006/main" xmlns:w14="http://schemas.microsoft.com/office/word/2010/wordml" xmlns:w15="http://schemas.microsoft.com/office/word/2012/wordml" xmlns:w16se="http://schemas.microsoft.com/office/word/2015/wordml/symex" xmlns:wpg="http://schemas.microsoft.com/office/word/2010/wordprocessingGroup" xmlns:wpi="http://schemas.microsoft.com/office/word/2010/wordprocessingInk" xmlns:wne="http://schemas.microsoft.com/office/word/2006/wordml" xmlns:wps="http://schemas.microsoft.com/office/word/2010/wordprocessingShape" mc:Ignorable="w14 w15 w16se wp14">
+<w:hdr xmlns:wpc="http://schemas.microsoft.com/office/word/2010/wordprocessingCanvas" xmlns:cx="http://schemas.microsoft.com/office/drawing/2014/chartex" xmlns:cx1="http://schemas.microsoft.com/office/drawing/2015/9/8/chartex" xmlns:cx2="http://schemas.microsoft.com/office/drawing/2015/10/21/chartex" xmlns:cx3="http://schemas.microsoft.com/office/drawing/2016/5/9/chartex" xmlns:cx4="http://schemas.microsoft.com/office/drawing/2016/5/10/chartex" xmlns:cx5="http://schemas.microsoft.com/office/drawing/2016/5/11/chartex" xmlns:cx6="http://schemas.microsoft.com/office/drawing/2016/5/12/chartex" xmlns:cx7="http://schemas.microsoft.com/office/drawing/2016/5/13/chartex" xmlns:cx8="http://schemas.microsoft.com/office/drawing/2016/5/14/chartex" xmlns:mc="http://schemas.openxmlformats.org/markup-compatibility/2006" xmlns:aink="http://schemas.microsoft.com/office/drawing/2016/ink" xmlns:am3d="http://schemas.microsoft.com/office/drawing/2017/model3d" xmlns:o="urn:schemas-microsoft-com:office:office" xmlns:oel="http://schemas.microsoft.com/office/2019/extlst" xmlns:r="http://schemas.openxmlformats.org/officeDocument/2006/relationships" xmlns:m="http://schemas.openxmlformats.org/officeDocument/2006/math" xmlns:v="urn:schemas-microsoft-com:vml" xmlns:wp14="http://schemas.microsoft.com/office/word/2010/wordprocessingDrawing" xmlns:wp="http://schemas.openxmlformats.org/drawingml/2006/wordprocessingDrawing" xmlns:w10="urn:schemas-microsoft-com:office:word" xmlns:w="http://schemas.openxmlformats.org/wordprocessingml/2006/main" xmlns:w14="http://schemas.microsoft.com/office/word/2010/wordml" xmlns:w15="http://schemas.microsoft.com/office/word/2012/wordml" xmlns:w16cex="http://schemas.microsoft.com/office/word/2018/wordml/cex" xmlns:w16cid="http://schemas.microsoft.com/office/word/2016/wordml/cid" xmlns:w16="http://schemas.microsoft.com/office/word/2018/wordml" xmlns:w16du="http://schemas.microsoft.com/office/word/2023/wordml/word16du" xmlns:w16sdtdh="http://schemas.microsoft.com/office/word/2020/wordml/sdtdatahash" xmlns:w16sdtfl="http://schemas.microsoft.com/office/word/2024/wordml/sdtformatlock" xmlns:w16se="http://schemas.microsoft.com/office/word/2015/wordml/symex" xmlns:wpg="http://schemas.microsoft.com/office/word/2010/wordprocessingGroup" xmlns:wpi="http://schemas.microsoft.com/office/word/2010/wordprocessingInk" xmlns:wne="http://schemas.microsoft.com/office/word/2006/wordml" xmlns:wps="http://schemas.microsoft.com/office/word/2010/wordprocessingShape" mc:Ignorable="w14 w15 w16se w16cid w16 w16cex w16sdtdh w16sdtfl w16du wp14">
   <w:p>
     <w:pPr>
       <w:pStyle w:val="Header"/>
@@ -35472,7 +35523,7 @@
 </file>
 
 <file path=word/numbering.xml><?xml version="1.0" encoding="utf-8"?>
-<w:numbering xmlns:wpc="http://schemas.microsoft.com/office/word/2010/wordprocessingCanvas" xmlns:cx="http://schemas.microsoft.com/office/drawing/2014/chartex" xmlns:mc="http://schemas.openxmlformats.org/markup-compatibility/2006" xmlns:o="urn:schemas-microsoft-com:office:office" xmlns:r="http://schemas.openxmlformats.org/officeDocument/2006/relationships" xmlns:m="http://schemas.openxmlformats.org/officeDocument/2006/math" xmlns:v="urn:schemas-microsoft-com:vml" xmlns:wp14="http://schemas.microsoft.com/office/word/2010/wordprocessingDrawing" xmlns:wp="http://schemas.openxmlformats.org/drawingml/2006/wordprocessingDrawing" xmlns:w10="urn:schemas-microsoft-com:office:word" xmlns:w="http://schemas.openxmlformats.org/wordprocessingml/2006/main" xmlns:w14="http://schemas.microsoft.com/office/word/2010/wordml" xmlns:w15="http://schemas.microsoft.com/office/word/2012/wordml" xmlns:w16se="http://schemas.microsoft.com/office/word/2015/wordml/symex" xmlns:wpg="http://schemas.microsoft.com/office/word/2010/wordprocessingGroup" xmlns:wpi="http://schemas.microsoft.com/office/word/2010/wordprocessingInk" xmlns:wne="http://schemas.microsoft.com/office/word/2006/wordml" xmlns:wps="http://schemas.microsoft.com/office/word/2010/wordprocessingShape" mc:Ignorable="w14 w15 w16se wp14">
+<w:numbering xmlns:wpc="http://schemas.microsoft.com/office/word/2010/wordprocessingCanvas" xmlns:cx="http://schemas.microsoft.com/office/drawing/2014/chartex" xmlns:cx1="http://schemas.microsoft.com/office/drawing/2015/9/8/chartex" xmlns:cx2="http://schemas.microsoft.com/office/drawing/2015/10/21/chartex" xmlns:cx3="http://schemas.microsoft.com/office/drawing/2016/5/9/chartex" xmlns:cx4="http://schemas.microsoft.com/office/drawing/2016/5/10/chartex" xmlns:cx5="http://schemas.microsoft.com/office/drawing/2016/5/11/chartex" xmlns:cx6="http://schemas.microsoft.com/office/drawing/2016/5/12/chartex" xmlns:cx7="http://schemas.microsoft.com/office/drawing/2016/5/13/chartex" xmlns:cx8="http://schemas.microsoft.com/office/drawing/2016/5/14/chartex" xmlns:mc="http://schemas.openxmlformats.org/markup-compatibility/2006" xmlns:aink="http://schemas.microsoft.com/office/drawing/2016/ink" xmlns:am3d="http://schemas.microsoft.com/office/drawing/2017/model3d" xmlns:o="urn:schemas-microsoft-com:office:office" xmlns:oel="http://schemas.microsoft.com/office/2019/extlst" xmlns:r="http://schemas.openxmlformats.org/officeDocument/2006/relationships" xmlns:m="http://schemas.openxmlformats.org/officeDocument/2006/math" xmlns:v="urn:schemas-microsoft-com:vml" xmlns:wp14="http://schemas.microsoft.com/office/word/2010/wordprocessingDrawing" xmlns:wp="http://schemas.openxmlformats.org/drawingml/2006/wordprocessingDrawing" xmlns:w10="urn:schemas-microsoft-com:office:word" xmlns:w="http://schemas.openxmlformats.org/wordprocessingml/2006/main" xmlns:w14="http://schemas.microsoft.com/office/word/2010/wordml" xmlns:w15="http://schemas.microsoft.com/office/word/2012/wordml" xmlns:w16cex="http://schemas.microsoft.com/office/word/2018/wordml/cex" xmlns:w16cid="http://schemas.microsoft.com/office/word/2016/wordml/cid" xmlns:w16="http://schemas.microsoft.com/office/word/2018/wordml" xmlns:w16du="http://schemas.microsoft.com/office/word/2023/wordml/word16du" xmlns:w16sdtdh="http://schemas.microsoft.com/office/word/2020/wordml/sdtdatahash" xmlns:w16sdtfl="http://schemas.microsoft.com/office/word/2024/wordml/sdtformatlock" xmlns:w16se="http://schemas.microsoft.com/office/word/2015/wordml/symex" xmlns:wpg="http://schemas.microsoft.com/office/word/2010/wordprocessingGroup" xmlns:wpi="http://schemas.microsoft.com/office/word/2010/wordprocessingInk" xmlns:wne="http://schemas.microsoft.com/office/word/2006/wordml" xmlns:wps="http://schemas.microsoft.com/office/word/2010/wordprocessingShape" mc:Ignorable="w14 w15 w16se w16cid w16 w16cex w16sdtdh w16sdtfl w16du wp14">
   <w:abstractNum w:abstractNumId="0" w15:restartNumberingAfterBreak="0">
     <w:nsid w:val="018448E5"/>
     <w:multiLevelType w:val="hybridMultilevel"/>
@@ -39248,107 +39299,107 @@
       </w:rPr>
     </w:lvl>
   </w:abstractNum>
-  <w:num w:numId="1">
+  <w:num w:numId="1" w16cid:durableId="218252678">
     <w:abstractNumId w:val="0"/>
   </w:num>
-  <w:num w:numId="2">
+  <w:num w:numId="2" w16cid:durableId="222372417">
     <w:abstractNumId w:val="16"/>
   </w:num>
-  <w:num w:numId="3">
+  <w:num w:numId="3" w16cid:durableId="995843715">
     <w:abstractNumId w:val="10"/>
   </w:num>
-  <w:num w:numId="4">
+  <w:num w:numId="4" w16cid:durableId="1121606859">
     <w:abstractNumId w:val="25"/>
   </w:num>
-  <w:num w:numId="5">
+  <w:num w:numId="5" w16cid:durableId="528378664">
     <w:abstractNumId w:val="31"/>
   </w:num>
-  <w:num w:numId="6">
+  <w:num w:numId="6" w16cid:durableId="1754929094">
     <w:abstractNumId w:val="17"/>
   </w:num>
-  <w:num w:numId="7">
+  <w:num w:numId="7" w16cid:durableId="1216621912">
     <w:abstractNumId w:val="23"/>
   </w:num>
-  <w:num w:numId="8">
+  <w:num w:numId="8" w16cid:durableId="959456217">
     <w:abstractNumId w:val="24"/>
   </w:num>
-  <w:num w:numId="9">
+  <w:num w:numId="9" w16cid:durableId="1085540450">
     <w:abstractNumId w:val="27"/>
   </w:num>
-  <w:num w:numId="10">
+  <w:num w:numId="10" w16cid:durableId="1174220743">
     <w:abstractNumId w:val="12"/>
   </w:num>
-  <w:num w:numId="11">
+  <w:num w:numId="11" w16cid:durableId="831457810">
     <w:abstractNumId w:val="15"/>
   </w:num>
-  <w:num w:numId="12">
+  <w:num w:numId="12" w16cid:durableId="1470365788">
     <w:abstractNumId w:val="4"/>
   </w:num>
-  <w:num w:numId="13">
+  <w:num w:numId="13" w16cid:durableId="934554963">
     <w:abstractNumId w:val="3"/>
   </w:num>
-  <w:num w:numId="14">
+  <w:num w:numId="14" w16cid:durableId="1522626279">
     <w:abstractNumId w:val="9"/>
   </w:num>
-  <w:num w:numId="15">
+  <w:num w:numId="15" w16cid:durableId="2092657333">
     <w:abstractNumId w:val="22"/>
   </w:num>
-  <w:num w:numId="16">
+  <w:num w:numId="16" w16cid:durableId="486484173">
     <w:abstractNumId w:val="19"/>
   </w:num>
-  <w:num w:numId="17">
+  <w:num w:numId="17" w16cid:durableId="1288269593">
     <w:abstractNumId w:val="14"/>
   </w:num>
-  <w:num w:numId="18">
+  <w:num w:numId="18" w16cid:durableId="210389366">
     <w:abstractNumId w:val="8"/>
   </w:num>
-  <w:num w:numId="19">
+  <w:num w:numId="19" w16cid:durableId="410780887">
     <w:abstractNumId w:val="1"/>
   </w:num>
-  <w:num w:numId="20">
+  <w:num w:numId="20" w16cid:durableId="640112191">
     <w:abstractNumId w:val="28"/>
   </w:num>
-  <w:num w:numId="21">
+  <w:num w:numId="21" w16cid:durableId="748190005">
     <w:abstractNumId w:val="7"/>
   </w:num>
-  <w:num w:numId="22">
+  <w:num w:numId="22" w16cid:durableId="380633392">
     <w:abstractNumId w:val="2"/>
   </w:num>
-  <w:num w:numId="23">
+  <w:num w:numId="23" w16cid:durableId="1230963912">
     <w:abstractNumId w:val="6"/>
   </w:num>
-  <w:num w:numId="24">
+  <w:num w:numId="24" w16cid:durableId="911430657">
     <w:abstractNumId w:val="26"/>
   </w:num>
-  <w:num w:numId="25">
+  <w:num w:numId="25" w16cid:durableId="2137093217">
     <w:abstractNumId w:val="13"/>
   </w:num>
-  <w:num w:numId="26">
+  <w:num w:numId="26" w16cid:durableId="1008828309">
     <w:abstractNumId w:val="18"/>
   </w:num>
-  <w:num w:numId="27">
+  <w:num w:numId="27" w16cid:durableId="196237770">
     <w:abstractNumId w:val="11"/>
   </w:num>
-  <w:num w:numId="28">
+  <w:num w:numId="28" w16cid:durableId="574778868">
     <w:abstractNumId w:val="20"/>
   </w:num>
-  <w:num w:numId="29">
+  <w:num w:numId="29" w16cid:durableId="1471093166">
     <w:abstractNumId w:val="5"/>
   </w:num>
-  <w:num w:numId="30">
+  <w:num w:numId="30" w16cid:durableId="1530606155">
     <w:abstractNumId w:val="21"/>
   </w:num>
-  <w:num w:numId="31">
+  <w:num w:numId="31" w16cid:durableId="732506441">
     <w:abstractNumId w:val="30"/>
   </w:num>
-  <w:num w:numId="32">
+  <w:num w:numId="32" w16cid:durableId="1950971476">
     <w:abstractNumId w:val="29"/>
   </w:num>
 </w:numbering>
 </file>
 
 <file path=word/styles.xml><?xml version="1.0" encoding="utf-8"?>
-<w:styles xmlns:mc="http://schemas.openxmlformats.org/markup-compatibility/2006" xmlns:r="http://schemas.openxmlformats.org/officeDocument/2006/relationships" xmlns:w="http://schemas.openxmlformats.org/wordprocessingml/2006/main" xmlns:w14="http://schemas.microsoft.com/office/word/2010/wordml" xmlns:w15="http://schemas.microsoft.com/office/word/2012/wordml" xmlns:w16se="http://schemas.microsoft.com/office/word/2015/wordml/symex" mc:Ignorable="w14 w15 w16se">
+<w:styles xmlns:mc="http://schemas.openxmlformats.org/markup-compatibility/2006" xmlns:r="http://schemas.openxmlformats.org/officeDocument/2006/relationships" xmlns:w="http://schemas.openxmlformats.org/wordprocessingml/2006/main" xmlns:w14="http://schemas.microsoft.com/office/word/2010/wordml" xmlns:w15="http://schemas.microsoft.com/office/word/2012/wordml" xmlns:w16cex="http://schemas.microsoft.com/office/word/2018/wordml/cex" xmlns:w16cid="http://schemas.microsoft.com/office/word/2016/wordml/cid" xmlns:w16="http://schemas.microsoft.com/office/word/2018/wordml" xmlns:w16du="http://schemas.microsoft.com/office/word/2023/wordml/word16du" xmlns:w16sdtdh="http://schemas.microsoft.com/office/word/2020/wordml/sdtdatahash" xmlns:w16sdtfl="http://schemas.microsoft.com/office/word/2024/wordml/sdtformatlock" xmlns:w16se="http://schemas.microsoft.com/office/word/2015/wordml/symex" mc:Ignorable="w14 w15 w16se w16cid w16 w16cex w16sdtdh w16sdtfl w16du">
   <w:docDefaults>
     <w:rPrDefault>
       <w:rPr>
@@ -39364,7 +39415,7 @@
       </w:pPr>
     </w:pPrDefault>
   </w:docDefaults>
-  <w:latentStyles w:defLockedState="0" w:defUIPriority="99" w:defSemiHidden="0" w:defUnhideWhenUsed="0" w:defQFormat="0" w:count="371">
+  <w:latentStyles w:defLockedState="0" w:defUIPriority="99" w:defSemiHidden="0" w:defUnhideWhenUsed="0" w:defQFormat="0" w:count="376">
     <w:lsdException w:name="Normal" w:uiPriority="0" w:qFormat="1"/>
     <w:lsdException w:name="heading 1" w:uiPriority="9" w:qFormat="1"/>
     <w:lsdException w:name="heading 2" w:semiHidden="1" w:uiPriority="9" w:unhideWhenUsed="1" w:qFormat="1"/>
@@ -39736,6 +39787,11 @@
     <w:lsdException w:name="List Table 5 Dark Accent 6" w:uiPriority="50"/>
     <w:lsdException w:name="List Table 6 Colorful Accent 6" w:uiPriority="51"/>
     <w:lsdException w:name="List Table 7 Colorful Accent 6" w:uiPriority="52"/>
+    <w:lsdException w:name="Mention" w:semiHidden="1" w:unhideWhenUsed="1"/>
+    <w:lsdException w:name="Smart Hyperlink" w:semiHidden="1" w:unhideWhenUsed="1"/>
+    <w:lsdException w:name="Hashtag" w:semiHidden="1" w:unhideWhenUsed="1"/>
+    <w:lsdException w:name="Unresolved Mention" w:semiHidden="1" w:unhideWhenUsed="1"/>
+    <w:lsdException w:name="Smart Link" w:semiHidden="1" w:unhideWhenUsed="1"/>
   </w:latentStyles>
   <w:style w:type="paragraph" w:default="1" w:styleId="Normal">
     <w:name w:val="Normal"/>
@@ -40293,8 +40349,8 @@
       <w:szCs w:val="26"/>
     </w:rPr>
   </w:style>
-  <w:style w:type="character" w:customStyle="1" w:styleId="UnresolvedMention">
-    <w:name w:val="Unresolved Mention"/>
+  <w:style w:type="character" w:customStyle="1" w:styleId="UnresolvedMention3">
+    <w:name w:val="Unresolved Mention3"/>
     <w:basedOn w:val="DefaultParagraphFont"/>
     <w:uiPriority w:val="99"/>
     <w:semiHidden/>

</xml_diff>